<commit_message>
US corrections in English
</commit_message>
<xml_diff>
--- a/udaka-shAnti/US Sanskrit Corrections.docx
+++ b/udaka-shAnti/US Sanskrit Corrections.docx
@@ -1,6 +1,6 @@
 
 <file path=word/document.xml><?xml version="1.0" encoding="utf-8"?>
-<w:document xmlns:wpc="http://schemas.microsoft.com/office/word/2010/wordprocessingCanvas" xmlns:cx="http://schemas.microsoft.com/office/drawing/2014/chartex" xmlns:cx1="http://schemas.microsoft.com/office/drawing/2015/9/8/chartex" xmlns:cx2="http://schemas.microsoft.com/office/drawing/2015/10/21/chartex" xmlns:cx3="http://schemas.microsoft.com/office/drawing/2016/5/9/chartex" xmlns:cx4="http://schemas.microsoft.com/office/drawing/2016/5/10/chartex" xmlns:cx5="http://schemas.microsoft.com/office/drawing/2016/5/11/chartex" xmlns:cx6="http://schemas.microsoft.com/office/drawing/2016/5/12/chartex" xmlns:cx7="http://schemas.microsoft.com/office/drawing/2016/5/13/chartex" xmlns:cx8="http://schemas.microsoft.com/office/drawing/2016/5/14/chartex" xmlns:mc="http://schemas.openxmlformats.org/markup-compatibility/2006" xmlns:aink="http://schemas.microsoft.com/office/drawing/2016/ink" xmlns:am3d="http://schemas.microsoft.com/office/drawing/2017/model3d" xmlns:o="urn:schemas-microsoft-com:office:office" xmlns:oel="http://schemas.microsoft.com/office/2019/extlst" xmlns:r="http://schemas.openxmlformats.org/officeDocument/2006/relationships" xmlns:m="http://schemas.openxmlformats.org/officeDocument/2006/math" xmlns:v="urn:schemas-microsoft-com:vml" xmlns:wp14="http://schemas.microsoft.com/office/word/2010/wordprocessingDrawing" xmlns:wp="http://schemas.openxmlformats.org/drawingml/2006/wordprocessingDrawing" xmlns:w10="urn:schemas-microsoft-com:office:word" xmlns:w="http://schemas.openxmlformats.org/wordprocessingml/2006/main" xmlns:w14="http://schemas.microsoft.com/office/word/2010/wordml" xmlns:w15="http://schemas.microsoft.com/office/word/2012/wordml" xmlns:w16cex="http://schemas.microsoft.com/office/word/2018/wordml/cex" xmlns:w16cid="http://schemas.microsoft.com/office/word/2016/wordml/cid" xmlns:w16="http://schemas.microsoft.com/office/word/2018/wordml" xmlns:w16sdtdh="http://schemas.microsoft.com/office/word/2020/wordml/sdtdatahash" xmlns:w16se="http://schemas.microsoft.com/office/word/2015/wordml/symex" xmlns:wpg="http://schemas.microsoft.com/office/word/2010/wordprocessingGroup" xmlns:wpi="http://schemas.microsoft.com/office/word/2010/wordprocessingInk" xmlns:wne="http://schemas.microsoft.com/office/word/2006/wordml" xmlns:wps="http://schemas.microsoft.com/office/word/2010/wordprocessingShape" mc:Ignorable="w14 w15 w16se w16cid w16 w16cex w16sdtdh wp14">
+<w:document xmlns:wpc="http://schemas.microsoft.com/office/word/2010/wordprocessingCanvas" xmlns:cx="http://schemas.microsoft.com/office/drawing/2014/chartex" xmlns:cx1="http://schemas.microsoft.com/office/drawing/2015/9/8/chartex" xmlns:cx2="http://schemas.microsoft.com/office/drawing/2015/10/21/chartex" xmlns:cx3="http://schemas.microsoft.com/office/drawing/2016/5/9/chartex" xmlns:cx4="http://schemas.microsoft.com/office/drawing/2016/5/10/chartex" xmlns:cx5="http://schemas.microsoft.com/office/drawing/2016/5/11/chartex" xmlns:cx6="http://schemas.microsoft.com/office/drawing/2016/5/12/chartex" xmlns:cx7="http://schemas.microsoft.com/office/drawing/2016/5/13/chartex" xmlns:cx8="http://schemas.microsoft.com/office/drawing/2016/5/14/chartex" xmlns:mc="http://schemas.openxmlformats.org/markup-compatibility/2006" xmlns:aink="http://schemas.microsoft.com/office/drawing/2016/ink" xmlns:am3d="http://schemas.microsoft.com/office/drawing/2017/model3d" xmlns:o="urn:schemas-microsoft-com:office:office" xmlns:oel="http://schemas.microsoft.com/office/2019/extlst" xmlns:r="http://schemas.openxmlformats.org/officeDocument/2006/relationships" xmlns:m="http://schemas.openxmlformats.org/officeDocument/2006/math" xmlns:v="urn:schemas-microsoft-com:vml" xmlns:wp14="http://schemas.microsoft.com/office/word/2010/wordprocessingDrawing" xmlns:wp="http://schemas.openxmlformats.org/drawingml/2006/wordprocessingDrawing" xmlns:w10="urn:schemas-microsoft-com:office:word" xmlns:w="http://schemas.openxmlformats.org/wordprocessingml/2006/main" xmlns:w14="http://schemas.microsoft.com/office/word/2010/wordml" xmlns:w15="http://schemas.microsoft.com/office/word/2012/wordml" xmlns:w16cex="http://schemas.microsoft.com/office/word/2018/wordml/cex" xmlns:w16cid="http://schemas.microsoft.com/office/word/2016/wordml/cid" xmlns:w16="http://schemas.microsoft.com/office/word/2018/wordml" xmlns:w16du="http://schemas.microsoft.com/office/word/2023/wordml/word16du" xmlns:w16sdtdh="http://schemas.microsoft.com/office/word/2020/wordml/sdtdatahash" xmlns:w16sdtfl="http://schemas.microsoft.com/office/word/2024/wordml/sdtformatlock" xmlns:w16se="http://schemas.microsoft.com/office/word/2015/wordml/symex" xmlns:wpg="http://schemas.microsoft.com/office/word/2010/wordprocessingGroup" xmlns:wpi="http://schemas.microsoft.com/office/word/2010/wordprocessingInk" xmlns:wne="http://schemas.microsoft.com/office/word/2006/wordml" xmlns:wps="http://schemas.microsoft.com/office/word/2010/wordprocessingShape" mc:Ignorable="w14 w15 w16se w16cid w16 w16cex w16sdtdh w16sdtfl w16du wp14">
   <w:body>
     <w:p>
       <w:pPr>
@@ -13,7 +13,6 @@
           <w:u w:val="single"/>
         </w:rPr>
       </w:pPr>
-      <w:proofErr w:type="spellStart"/>
       <w:r>
         <w:rPr>
           <w:b/>
@@ -21,17 +20,7 @@
           <w:szCs w:val="32"/>
           <w:u w:val="single"/>
         </w:rPr>
-        <w:t>Udaka</w:t>
-      </w:r>
-      <w:proofErr w:type="spellEnd"/>
-      <w:r>
-        <w:rPr>
-          <w:b/>
-          <w:sz w:val="32"/>
-          <w:szCs w:val="32"/>
-          <w:u w:val="single"/>
-        </w:rPr>
-        <w:t xml:space="preserve"> Shanti - </w:t>
+        <w:t xml:space="preserve">Udaka Shanti - </w:t>
       </w:r>
       <w:r>
         <w:rPr>
@@ -942,7 +931,6 @@
                 <w:szCs w:val="40"/>
               </w:rPr>
             </w:pPr>
-            <w:proofErr w:type="spellStart"/>
             <w:r>
               <w:rPr>
                 <w:rFonts w:ascii="BRH Devanagari Extra" w:hAnsi="BRH Devanagari Extra" w:cs="BRH Devanagari Extra"/>
@@ -954,7 +942,6 @@
               </w:rPr>
               <w:t>xÉ</w:t>
             </w:r>
-            <w:proofErr w:type="spellEnd"/>
             <w:r>
               <w:rPr>
                 <w:rFonts w:ascii="BRH Malayalam Extra" w:hAnsi="BRH Malayalam Extra" w:cs="BRH Devanagari Extra"/>
@@ -1249,7 +1236,6 @@
                 <w:highlight w:val="yellow"/>
               </w:rPr>
             </w:pPr>
-            <w:proofErr w:type="spellStart"/>
             <w:r>
               <w:rPr>
                 <w:rFonts w:ascii="BRH Devanagari Extra" w:hAnsi="BRH Devanagari Extra" w:cs="BRH Devanagari Extra"/>
@@ -1259,7 +1245,6 @@
               </w:rPr>
               <w:t>AnxÉ</w:t>
             </w:r>
-            <w:proofErr w:type="spellEnd"/>
             <w:r>
               <w:rPr>
                 <w:rFonts w:ascii="BRH Malayalam Extra" w:hAnsi="BRH Malayalam Extra" w:cs="BRH Devanagari Extra"/>
@@ -1306,19 +1291,8 @@
                 <w:sz w:val="40"/>
                 <w:szCs w:val="34"/>
               </w:rPr>
-              <w:t xml:space="preserve"> </w:t>
-            </w:r>
-            <w:proofErr w:type="spellStart"/>
-            <w:r>
-              <w:rPr>
-                <w:rFonts w:ascii="BRH Devanagari Extra" w:hAnsi="BRH Devanagari Extra" w:cs="BRH Devanagari Extra"/>
-                <w:color w:val="000000"/>
-                <w:sz w:val="40"/>
-                <w:szCs w:val="34"/>
-              </w:rPr>
-              <w:t>xiÉ</w:t>
-            </w:r>
-            <w:proofErr w:type="spellEnd"/>
+              <w:t xml:space="preserve"> xiÉ</w:t>
+            </w:r>
             <w:r>
               <w:rPr>
                 <w:rFonts w:ascii="BRH Malayalam Extra" w:hAnsi="BRH Malayalam Extra" w:cs="BRH Devanagari Extra"/>
@@ -1357,7 +1331,6 @@
                 <w:highlight w:val="green"/>
               </w:rPr>
             </w:pPr>
-            <w:proofErr w:type="spellStart"/>
             <w:r>
               <w:rPr>
                 <w:rFonts w:ascii="BRH Devanagari Extra" w:hAnsi="BRH Devanagari Extra" w:cs="BRH Devanagari Extra"/>
@@ -1367,7 +1340,6 @@
               </w:rPr>
               <w:t>AnxÉ</w:t>
             </w:r>
-            <w:proofErr w:type="spellEnd"/>
             <w:r>
               <w:rPr>
                 <w:rFonts w:ascii="BRH Malayalam Extra" w:hAnsi="BRH Malayalam Extra" w:cs="BRH Devanagari Extra"/>
@@ -1405,19 +1377,8 @@
                 <w:sz w:val="40"/>
                 <w:szCs w:val="34"/>
               </w:rPr>
-              <w:t xml:space="preserve"> </w:t>
-            </w:r>
-            <w:proofErr w:type="spellStart"/>
-            <w:r>
-              <w:rPr>
-                <w:rFonts w:ascii="BRH Devanagari Extra" w:hAnsi="BRH Devanagari Extra" w:cs="BRH Devanagari Extra"/>
-                <w:color w:val="000000"/>
-                <w:sz w:val="40"/>
-                <w:szCs w:val="34"/>
-              </w:rPr>
-              <w:t>xiÉ</w:t>
-            </w:r>
-            <w:proofErr w:type="spellEnd"/>
+              <w:t xml:space="preserve"> xiÉ</w:t>
+            </w:r>
             <w:r>
               <w:rPr>
                 <w:rFonts w:ascii="BRH Malayalam Extra" w:hAnsi="BRH Malayalam Extra" w:cs="BRH Devanagari Extra"/>
@@ -2032,7 +1993,6 @@
                 <w:szCs w:val="34"/>
               </w:rPr>
             </w:pPr>
-            <w:proofErr w:type="spellStart"/>
             <w:r>
               <w:rPr>
                 <w:rFonts w:ascii="BRH Devanagari Extra" w:hAnsi="BRH Devanagari Extra" w:cs="BRH Devanagari Extra"/>
@@ -2044,7 +2004,6 @@
               </w:rPr>
               <w:t>xÉ</w:t>
             </w:r>
-            <w:proofErr w:type="spellEnd"/>
             <w:r>
               <w:rPr>
                 <w:rFonts w:ascii="BRH Malayalam Extra" w:hAnsi="BRH Malayalam Extra" w:cs="BRH Devanagari Extra"/>
@@ -2056,7 +2015,6 @@
               </w:rPr>
               <w:t>–</w:t>
             </w:r>
-            <w:proofErr w:type="spellStart"/>
             <w:r>
               <w:rPr>
                 <w:rFonts w:ascii="BRH Devanagari Extra" w:hAnsi="BRH Devanagari Extra" w:cs="BRH Devanagari Extra"/>
@@ -2078,7 +2036,6 @@
               </w:rPr>
               <w:t>è</w:t>
             </w:r>
-            <w:proofErr w:type="spellEnd"/>
             <w:r>
               <w:rPr>
                 <w:rFonts w:ascii="BRH Malayalam Extra" w:hAnsi="BRH Malayalam Extra" w:cs="BRH Devanagari Extra"/>
@@ -3426,19 +3383,8 @@
                 <w:sz w:val="40"/>
                 <w:szCs w:val="34"/>
               </w:rPr>
-              <w:t xml:space="preserve"> </w:t>
-            </w:r>
-            <w:proofErr w:type="spellStart"/>
-            <w:r>
-              <w:rPr>
-                <w:rFonts w:ascii="BRH Devanagari Extra" w:hAnsi="BRH Devanagari Extra" w:cs="BRH Devanagari Extra"/>
-                <w:color w:val="000000"/>
-                <w:sz w:val="40"/>
-                <w:szCs w:val="34"/>
-              </w:rPr>
-              <w:t>mÉ</w:t>
-            </w:r>
-            <w:proofErr w:type="spellEnd"/>
+              <w:t xml:space="preserve"> mÉ</w:t>
+            </w:r>
             <w:r>
               <w:rPr>
                 <w:rFonts w:ascii="BRH Malayalam Extra" w:hAnsi="BRH Malayalam Extra" w:cs="BRH Devanagari Extra"/>
@@ -3551,19 +3497,8 @@
                 <w:sz w:val="40"/>
                 <w:szCs w:val="34"/>
               </w:rPr>
-              <w:t xml:space="preserve"> </w:t>
-            </w:r>
-            <w:proofErr w:type="spellStart"/>
-            <w:r>
-              <w:rPr>
-                <w:rFonts w:ascii="BRH Devanagari Extra" w:hAnsi="BRH Devanagari Extra" w:cs="BRH Devanagari Extra"/>
-                <w:color w:val="000000"/>
-                <w:sz w:val="40"/>
-                <w:szCs w:val="34"/>
-              </w:rPr>
-              <w:t>mÉ</w:t>
-            </w:r>
-            <w:proofErr w:type="spellEnd"/>
+              <w:t xml:space="preserve"> mÉ</w:t>
+            </w:r>
             <w:r>
               <w:rPr>
                 <w:rFonts w:ascii="BRH Malayalam Extra" w:hAnsi="BRH Malayalam Extra" w:cs="BRH Devanagari Extra"/>
@@ -4356,19 +4291,8 @@
                 <w:sz w:val="40"/>
                 <w:szCs w:val="34"/>
               </w:rPr>
-              <w:t xml:space="preserve"> </w:t>
-            </w:r>
-            <w:proofErr w:type="spellStart"/>
-            <w:r>
-              <w:rPr>
-                <w:rFonts w:ascii="BRH Devanagari Extra" w:hAnsi="BRH Devanagari Extra" w:cs="BRH Devanagari Extra"/>
-                <w:color w:val="000000"/>
-                <w:sz w:val="40"/>
-                <w:szCs w:val="34"/>
-              </w:rPr>
-              <w:t>xÉ</w:t>
-            </w:r>
-            <w:proofErr w:type="spellEnd"/>
+              <w:t xml:space="preserve"> xÉ</w:t>
+            </w:r>
             <w:r>
               <w:rPr>
                 <w:rFonts w:ascii="BRH Malayalam Extra" w:hAnsi="BRH Malayalam Extra" w:cs="BRH Devanagari Extra"/>
@@ -4491,19 +4415,8 @@
                 <w:sz w:val="40"/>
                 <w:szCs w:val="34"/>
               </w:rPr>
-              <w:t xml:space="preserve"> </w:t>
-            </w:r>
-            <w:proofErr w:type="spellStart"/>
-            <w:r>
-              <w:rPr>
-                <w:rFonts w:ascii="BRH Devanagari Extra" w:hAnsi="BRH Devanagari Extra" w:cs="BRH Devanagari Extra"/>
-                <w:color w:val="000000"/>
-                <w:sz w:val="40"/>
-                <w:szCs w:val="34"/>
-              </w:rPr>
-              <w:t>xÉ</w:t>
-            </w:r>
-            <w:proofErr w:type="spellEnd"/>
+              <w:t xml:space="preserve"> xÉ</w:t>
+            </w:r>
             <w:r>
               <w:rPr>
                 <w:rFonts w:ascii="BRH Malayalam Extra" w:hAnsi="BRH Malayalam Extra" w:cs="BRH Devanagari Extra"/>
@@ -4901,19 +4814,8 @@
                 <w:sz w:val="28"/>
                 <w:szCs w:val="28"/>
               </w:rPr>
-              <w:t xml:space="preserve"> </w:t>
-            </w:r>
-            <w:proofErr w:type="spellStart"/>
-            <w:r>
-              <w:rPr>
-                <w:b/>
-                <w:bCs/>
-                <w:sz w:val="28"/>
-                <w:szCs w:val="28"/>
-              </w:rPr>
-              <w:t>Suktam</w:t>
-            </w:r>
-            <w:proofErr w:type="spellEnd"/>
+              <w:t xml:space="preserve"> Suktam</w:t>
+            </w:r>
           </w:p>
           <w:p>
             <w:pPr>
@@ -5247,7 +5149,6 @@
           <w:u w:val="single"/>
         </w:rPr>
       </w:pPr>
-      <w:proofErr w:type="spellStart"/>
       <w:r>
         <w:rPr>
           <w:b/>
@@ -5256,17 +5157,7 @@
           <w:u w:val="single"/>
         </w:rPr>
         <w:lastRenderedPageBreak/>
-        <w:t>Udaka</w:t>
-      </w:r>
-      <w:proofErr w:type="spellEnd"/>
-      <w:r>
-        <w:rPr>
-          <w:b/>
-          <w:sz w:val="32"/>
-          <w:szCs w:val="32"/>
-          <w:u w:val="single"/>
-        </w:rPr>
-        <w:t xml:space="preserve"> Shanti - </w:t>
+        <w:t xml:space="preserve">Udaka Shanti - </w:t>
       </w:r>
       <w:r>
         <w:rPr>
@@ -6005,25 +5896,7 @@
                 <w:sz w:val="40"/>
                 <w:szCs w:val="40"/>
               </w:rPr>
-              <w:t xml:space="preserve"> </w:t>
-            </w:r>
-            <w:proofErr w:type="spellStart"/>
-            <w:r>
-              <w:rPr>
-                <w:rFonts w:ascii="BRH Devanagari Extra" w:hAnsi="BRH Devanagari Extra" w:cs="BRH Devanagari Extra"/>
-                <w:sz w:val="40"/>
-                <w:szCs w:val="40"/>
-              </w:rPr>
-              <w:t>aÉ</w:t>
-            </w:r>
-            <w:proofErr w:type="spellEnd"/>
-            <w:r>
-              <w:rPr>
-                <w:rFonts w:ascii="BRH Devanagari Extra" w:hAnsi="BRH Devanagari Extra" w:cs="BRH Devanagari Extra"/>
-                <w:sz w:val="40"/>
-                <w:szCs w:val="40"/>
-              </w:rPr>
-              <w:t>×º</w:t>
+              <w:t xml:space="preserve"> aÉ×º</w:t>
             </w:r>
             <w:proofErr w:type="spellStart"/>
             <w:r>
@@ -6115,25 +5988,7 @@
                 <w:sz w:val="40"/>
                 <w:szCs w:val="40"/>
               </w:rPr>
-              <w:t xml:space="preserve"> </w:t>
-            </w:r>
-            <w:proofErr w:type="spellStart"/>
-            <w:r>
-              <w:rPr>
-                <w:rFonts w:ascii="BRH Devanagari Extra" w:hAnsi="BRH Devanagari Extra" w:cs="BRH Devanagari Extra"/>
-                <w:sz w:val="40"/>
-                <w:szCs w:val="40"/>
-              </w:rPr>
-              <w:t>aÉ</w:t>
-            </w:r>
-            <w:proofErr w:type="spellEnd"/>
-            <w:r>
-              <w:rPr>
-                <w:rFonts w:ascii="BRH Devanagari Extra" w:hAnsi="BRH Devanagari Extra" w:cs="BRH Devanagari Extra"/>
-                <w:sz w:val="40"/>
-                <w:szCs w:val="40"/>
-              </w:rPr>
-              <w:t>×º</w:t>
+              <w:t xml:space="preserve"> aÉ×º</w:t>
             </w:r>
             <w:proofErr w:type="spellStart"/>
             <w:r>
@@ -6186,25 +6041,14 @@
                 <w:szCs w:val="28"/>
               </w:rPr>
             </w:pPr>
-            <w:proofErr w:type="spellStart"/>
-            <w:r>
-              <w:rPr>
-                <w:b/>
-                <w:bCs/>
-                <w:sz w:val="28"/>
-                <w:szCs w:val="28"/>
-              </w:rPr>
-              <w:t>naa</w:t>
-            </w:r>
-            <w:proofErr w:type="spellEnd"/>
-            <w:r>
-              <w:rPr>
-                <w:b/>
-                <w:bCs/>
-                <w:sz w:val="28"/>
-                <w:szCs w:val="28"/>
-              </w:rPr>
-              <w:t xml:space="preserve"> </w:t>
+            <w:r>
+              <w:rPr>
+                <w:b/>
+                <w:bCs/>
+                <w:sz w:val="28"/>
+                <w:szCs w:val="28"/>
+              </w:rPr>
+              <w:t xml:space="preserve">naa </w:t>
             </w:r>
             <w:proofErr w:type="spellStart"/>
             <w:r>
@@ -6325,7 +6169,6 @@
               </w:rPr>
               <w:t>–</w:t>
             </w:r>
-            <w:proofErr w:type="spellStart"/>
             <w:r>
               <w:rPr>
                 <w:rFonts w:ascii="BRH Devanagari Extra" w:hAnsi="BRH Devanagari Extra" w:cs="BRH Devanagari Extra"/>
@@ -6336,7 +6179,6 @@
               </w:rPr>
               <w:t>kÉ</w:t>
             </w:r>
-            <w:proofErr w:type="spellEnd"/>
             <w:r>
               <w:rPr>
                 <w:rFonts w:ascii="BRH Devanagari Extra" w:hAnsi="BRH Devanagari Extra" w:cs="BRH Devanagari Extra"/>
@@ -6366,26 +6208,17 @@
               </w:rPr>
               <w:t>–</w:t>
             </w:r>
-            <w:proofErr w:type="spellStart"/>
-            <w:r>
-              <w:rPr>
-                <w:rFonts w:ascii="BRH Devanagari Extra" w:hAnsi="BRH Devanagari Extra" w:cs="BRH Devanagari Extra"/>
-                <w:color w:val="000000"/>
-                <w:sz w:val="40"/>
-                <w:szCs w:val="34"/>
-              </w:rPr>
-              <w:t>xÉÏ</w:t>
-            </w:r>
-            <w:proofErr w:type="spellEnd"/>
-            <w:r>
-              <w:rPr>
-                <w:rFonts w:ascii="BRH Devanagari Extra" w:hAnsi="BRH Devanagari Extra" w:cs="BRH Devanagari Extra"/>
-                <w:color w:val="000000"/>
-                <w:sz w:val="40"/>
-                <w:szCs w:val="34"/>
-              </w:rPr>
-              <w:t>(</w:t>
-            </w:r>
+            <w:proofErr w:type="gramStart"/>
+            <w:r>
+              <w:rPr>
+                <w:rFonts w:ascii="BRH Devanagari Extra" w:hAnsi="BRH Devanagari Extra" w:cs="BRH Devanagari Extra"/>
+                <w:color w:val="000000"/>
+                <w:sz w:val="40"/>
+                <w:szCs w:val="34"/>
+              </w:rPr>
+              <w:t>xÉÏ(</w:t>
+            </w:r>
+            <w:proofErr w:type="gramEnd"/>
             <w:r>
               <w:rPr>
                 <w:rFonts w:cs="Arial"/>
@@ -6458,6 +6291,7 @@
               <w:t xml:space="preserve"> </w:t>
             </w:r>
             <w:proofErr w:type="spellStart"/>
+            <w:proofErr w:type="gramStart"/>
             <w:r>
               <w:rPr>
                 <w:rFonts w:ascii="BRH Devanagari Extra" w:hAnsi="BRH Devanagari Extra" w:cs="BRH Devanagari Extra"/>
@@ -6493,19 +6327,9 @@
                 <w:sz w:val="40"/>
                 <w:szCs w:val="34"/>
               </w:rPr>
-              <w:t>)</w:t>
-            </w:r>
-            <w:proofErr w:type="spellStart"/>
-            <w:r>
-              <w:rPr>
-                <w:rFonts w:ascii="BRH Devanagari Extra" w:hAnsi="BRH Devanagari Extra" w:cs="BRH Devanagari Extra"/>
-                <w:color w:val="000000"/>
-                <w:sz w:val="40"/>
-                <w:szCs w:val="34"/>
-              </w:rPr>
-              <w:t>iÉç</w:t>
-            </w:r>
-            <w:proofErr w:type="spellEnd"/>
+              <w:t>)iÉç</w:t>
+            </w:r>
+            <w:proofErr w:type="gramEnd"/>
             <w:r>
               <w:rPr>
                 <w:rFonts w:ascii="BRH Devanagari Extra" w:hAnsi="BRH Devanagari Extra" w:cs="BRH Devanagari Extra"/>
@@ -6594,26 +6418,17 @@
               </w:rPr>
               <w:t>–</w:t>
             </w:r>
-            <w:proofErr w:type="spellStart"/>
-            <w:r>
-              <w:rPr>
-                <w:rFonts w:ascii="BRH Devanagari Extra" w:hAnsi="BRH Devanagari Extra" w:cs="BRH Devanagari Extra"/>
-                <w:color w:val="000000"/>
-                <w:sz w:val="40"/>
-                <w:szCs w:val="34"/>
-              </w:rPr>
-              <w:t>xÉÏ</w:t>
-            </w:r>
-            <w:proofErr w:type="spellEnd"/>
-            <w:r>
-              <w:rPr>
-                <w:rFonts w:ascii="BRH Devanagari Extra" w:hAnsi="BRH Devanagari Extra" w:cs="BRH Devanagari Extra"/>
-                <w:color w:val="000000"/>
-                <w:sz w:val="40"/>
-                <w:szCs w:val="34"/>
-              </w:rPr>
-              <w:t>(</w:t>
-            </w:r>
+            <w:proofErr w:type="gramStart"/>
+            <w:r>
+              <w:rPr>
+                <w:rFonts w:ascii="BRH Devanagari Extra" w:hAnsi="BRH Devanagari Extra" w:cs="BRH Devanagari Extra"/>
+                <w:color w:val="000000"/>
+                <w:sz w:val="40"/>
+                <w:szCs w:val="34"/>
+              </w:rPr>
+              <w:t>xÉÏ(</w:t>
+            </w:r>
+            <w:proofErr w:type="gramEnd"/>
             <w:r>
               <w:rPr>
                 <w:rFonts w:cs="Arial"/>
@@ -6686,6 +6501,7 @@
               <w:t xml:space="preserve"> </w:t>
             </w:r>
             <w:proofErr w:type="spellStart"/>
+            <w:proofErr w:type="gramStart"/>
             <w:r>
               <w:rPr>
                 <w:rFonts w:ascii="BRH Devanagari Extra" w:hAnsi="BRH Devanagari Extra" w:cs="BRH Devanagari Extra"/>
@@ -6721,19 +6537,9 @@
                 <w:sz w:val="40"/>
                 <w:szCs w:val="34"/>
               </w:rPr>
-              <w:t>)</w:t>
-            </w:r>
-            <w:proofErr w:type="spellStart"/>
-            <w:r>
-              <w:rPr>
-                <w:rFonts w:ascii="BRH Devanagari Extra" w:hAnsi="BRH Devanagari Extra" w:cs="BRH Devanagari Extra"/>
-                <w:color w:val="000000"/>
-                <w:sz w:val="40"/>
-                <w:szCs w:val="34"/>
-              </w:rPr>
-              <w:t>iÉç</w:t>
-            </w:r>
-            <w:proofErr w:type="spellEnd"/>
+              <w:t>)iÉç</w:t>
+            </w:r>
+            <w:proofErr w:type="gramEnd"/>
             <w:r>
               <w:rPr>
                 <w:rFonts w:ascii="BRH Devanagari Extra" w:hAnsi="BRH Devanagari Extra" w:cs="BRH Devanagari Extra"/>
@@ -6881,7 +6687,27 @@
                 <w:sz w:val="28"/>
                 <w:szCs w:val="28"/>
               </w:rPr>
-              <w:t xml:space="preserve"> Mantra, para No. 6</w:t>
+              <w:t xml:space="preserve"> Mantra, </w:t>
+            </w:r>
+            <w:proofErr w:type="gramStart"/>
+            <w:r>
+              <w:rPr>
+                <w:b/>
+                <w:bCs/>
+                <w:sz w:val="28"/>
+                <w:szCs w:val="28"/>
+              </w:rPr>
+              <w:t>para No.</w:t>
+            </w:r>
+            <w:proofErr w:type="gramEnd"/>
+            <w:r>
+              <w:rPr>
+                <w:b/>
+                <w:bCs/>
+                <w:sz w:val="28"/>
+                <w:szCs w:val="28"/>
+              </w:rPr>
+              <w:t xml:space="preserve"> 6</w:t>
             </w:r>
           </w:p>
         </w:tc>
@@ -7107,15 +6933,6 @@
                 <w:sz w:val="28"/>
                 <w:szCs w:val="28"/>
               </w:rPr>
-              <w:t>1</w:t>
-            </w:r>
-            <w:r>
-              <w:rPr>
-                <w:b/>
-                <w:bCs/>
-                <w:sz w:val="28"/>
-                <w:szCs w:val="28"/>
-              </w:rPr>
               <w:t xml:space="preserve">1.36 &amp; 1.40 </w:t>
             </w:r>
           </w:p>
@@ -7226,7 +7043,27 @@
                 <w:sz w:val="28"/>
                 <w:szCs w:val="28"/>
               </w:rPr>
-              <w:t xml:space="preserve"> Mantra, para No. 6</w:t>
+              <w:t xml:space="preserve"> Mantra, </w:t>
+            </w:r>
+            <w:proofErr w:type="gramStart"/>
+            <w:r>
+              <w:rPr>
+                <w:b/>
+                <w:bCs/>
+                <w:sz w:val="28"/>
+                <w:szCs w:val="28"/>
+              </w:rPr>
+              <w:t>para No.</w:t>
+            </w:r>
+            <w:proofErr w:type="gramEnd"/>
+            <w:r>
+              <w:rPr>
+                <w:b/>
+                <w:bCs/>
+                <w:sz w:val="28"/>
+                <w:szCs w:val="28"/>
+              </w:rPr>
+              <w:t xml:space="preserve"> 6</w:t>
             </w:r>
           </w:p>
         </w:tc>
@@ -7473,6 +7310,7 @@
               <w:t>(</w:t>
             </w:r>
             <w:proofErr w:type="spellStart"/>
+            <w:proofErr w:type="gramStart"/>
             <w:r>
               <w:rPr>
                 <w:rFonts w:cs="Arial"/>
@@ -7508,7 +7346,17 @@
                 <w:sz w:val="28"/>
                 <w:szCs w:val="34"/>
               </w:rPr>
-              <w:t xml:space="preserve"> “s” added)</w:t>
+              <w:t xml:space="preserve"> “</w:t>
+            </w:r>
+            <w:proofErr w:type="gramEnd"/>
+            <w:r>
+              <w:rPr>
+                <w:rFonts w:cs="Arial"/>
+                <w:color w:val="000000"/>
+                <w:sz w:val="28"/>
+                <w:szCs w:val="34"/>
+              </w:rPr>
+              <w:t>s” added)</w:t>
             </w:r>
           </w:p>
         </w:tc>
@@ -7753,6 +7601,7 @@
                 <w:szCs w:val="28"/>
               </w:rPr>
             </w:pPr>
+            <w:proofErr w:type="gramStart"/>
             <w:r>
               <w:rPr>
                 <w:b/>
@@ -7771,6 +7620,7 @@
               </w:rPr>
               <w:t>37</w:t>
             </w:r>
+            <w:proofErr w:type="gramEnd"/>
           </w:p>
           <w:p>
             <w:pPr>
@@ -8609,6 +8459,7 @@
               <w:t>(</w:t>
             </w:r>
             <w:proofErr w:type="spellStart"/>
+            <w:proofErr w:type="gramStart"/>
             <w:r>
               <w:rPr>
                 <w:rFonts w:cs="Arial"/>
@@ -8644,7 +8495,17 @@
                 <w:sz w:val="28"/>
                 <w:szCs w:val="34"/>
               </w:rPr>
-              <w:t xml:space="preserve"> “s” added)</w:t>
+              <w:t xml:space="preserve"> “</w:t>
+            </w:r>
+            <w:proofErr w:type="gramEnd"/>
+            <w:r>
+              <w:rPr>
+                <w:rFonts w:cs="Arial"/>
+                <w:color w:val="000000"/>
+                <w:sz w:val="28"/>
+                <w:szCs w:val="34"/>
+              </w:rPr>
+              <w:t>s” added)</w:t>
             </w:r>
           </w:p>
         </w:tc>
@@ -9209,7 +9070,27 @@
                 <w:sz w:val="28"/>
                 <w:szCs w:val="28"/>
               </w:rPr>
-              <w:t xml:space="preserve">1.38 VaruNa </w:t>
+              <w:t xml:space="preserve">1.38 </w:t>
+            </w:r>
+            <w:proofErr w:type="spellStart"/>
+            <w:r>
+              <w:rPr>
+                <w:b/>
+                <w:bCs/>
+                <w:sz w:val="28"/>
+                <w:szCs w:val="28"/>
+              </w:rPr>
+              <w:t>VaruNa</w:t>
+            </w:r>
+            <w:proofErr w:type="spellEnd"/>
+            <w:r>
+              <w:rPr>
+                <w:b/>
+                <w:bCs/>
+                <w:sz w:val="28"/>
+                <w:szCs w:val="28"/>
+              </w:rPr>
+              <w:t xml:space="preserve"> </w:t>
             </w:r>
             <w:proofErr w:type="spellStart"/>
             <w:r>
@@ -9564,7 +9445,6 @@
           <w:u w:val="single"/>
         </w:rPr>
       </w:pPr>
-      <w:proofErr w:type="spellStart"/>
       <w:r>
         <w:rPr>
           <w:b/>
@@ -9594,18 +9474,7 @@
           <w:szCs w:val="32"/>
           <w:u w:val="single"/>
         </w:rPr>
-        <w:t>a</w:t>
-      </w:r>
-      <w:proofErr w:type="spellEnd"/>
-      <w:r>
-        <w:rPr>
-          <w:b/>
-          <w:bCs/>
-          <w:sz w:val="32"/>
-          <w:szCs w:val="32"/>
-          <w:u w:val="single"/>
-        </w:rPr>
-        <w:t xml:space="preserve"> Shanti </w:t>
+        <w:t xml:space="preserve">a Shanti </w:t>
       </w:r>
       <w:r>
         <w:rPr>
@@ -10179,7 +10048,6 @@
               </w:rPr>
               <w:t>–</w:t>
             </w:r>
-            <w:proofErr w:type="spellStart"/>
             <w:r>
               <w:rPr>
                 <w:rFonts w:ascii="BRH Devanagari Extra" w:hAnsi="BRH Devanagari Extra" w:cs="BRH Devanagari Extra"/>
@@ -10191,7 +10059,6 @@
               </w:rPr>
               <w:t>Uç</w:t>
             </w:r>
-            <w:proofErr w:type="spellEnd"/>
           </w:p>
         </w:tc>
         <w:tc>
@@ -10408,7 +10275,6 @@
               </w:rPr>
               <w:t>–</w:t>
             </w:r>
-            <w:proofErr w:type="spellStart"/>
             <w:r>
               <w:rPr>
                 <w:rFonts w:ascii="BRH Devanagari Extra" w:hAnsi="BRH Devanagari Extra" w:cs="BRH Devanagari Extra"/>
@@ -10420,7 +10286,6 @@
               </w:rPr>
               <w:t>Uç</w:t>
             </w:r>
-            <w:proofErr w:type="spellEnd"/>
             <w:r>
               <w:rPr>
                 <w:rFonts w:ascii="BRH Devanagari Extra" w:hAnsi="BRH Devanagari Extra" w:cs="BRH Devanagari Extra"/>
@@ -10598,7 +10463,6 @@
               </w:rPr>
               <w:t>–</w:t>
             </w:r>
-            <w:proofErr w:type="spellStart"/>
             <w:r>
               <w:rPr>
                 <w:rFonts w:ascii="BRH Devanagari Extra" w:hAnsi="BRH Devanagari Extra" w:cs="BRH Devanagari Extra"/>
@@ -10607,7 +10471,6 @@
               </w:rPr>
               <w:t>lÉç</w:t>
             </w:r>
-            <w:proofErr w:type="spellEnd"/>
             <w:r>
               <w:rPr>
                 <w:rFonts w:ascii="BRH Devanagari Extra" w:hAnsi="BRH Devanagari Extra" w:cs="BRH Devanagari Extra"/>
@@ -10645,6 +10508,7 @@
               <w:t>ûþÌiÉ</w:t>
             </w:r>
             <w:proofErr w:type="spellEnd"/>
+            <w:proofErr w:type="gramStart"/>
             <w:r>
               <w:rPr>
                 <w:rFonts w:ascii="BRH Malayalam Extra" w:hAnsi="BRH Malayalam Extra" w:cs="BRH Devanagari Extra"/>
@@ -10674,6 +10538,7 @@
               </w:rPr>
               <w:t>,</w:t>
             </w:r>
+            <w:proofErr w:type="gramEnd"/>
           </w:p>
         </w:tc>
         <w:tc>
@@ -10808,7 +10673,6 @@
               </w:rPr>
               <w:t>–</w:t>
             </w:r>
-            <w:proofErr w:type="spellStart"/>
             <w:r>
               <w:rPr>
                 <w:rFonts w:ascii="BRH Devanagari Extra" w:hAnsi="BRH Devanagari Extra" w:cs="BRH Devanagari Extra"/>
@@ -10817,7 +10681,6 @@
               </w:rPr>
               <w:t>lÉç</w:t>
             </w:r>
-            <w:proofErr w:type="spellEnd"/>
             <w:r>
               <w:rPr>
                 <w:rFonts w:ascii="BRH Devanagari Extra" w:hAnsi="BRH Devanagari Extra" w:cs="BRH Devanagari Extra"/>
@@ -10855,6 +10718,7 @@
               <w:t>ûþÌiÉ</w:t>
             </w:r>
             <w:proofErr w:type="spellEnd"/>
+            <w:proofErr w:type="gramStart"/>
             <w:r>
               <w:rPr>
                 <w:rFonts w:ascii="BRH Malayalam Extra" w:hAnsi="BRH Malayalam Extra" w:cs="BRH Devanagari Extra"/>
@@ -10884,6 +10748,7 @@
               </w:rPr>
               <w:t>,</w:t>
             </w:r>
+            <w:proofErr w:type="gramEnd"/>
           </w:p>
         </w:tc>
       </w:tr>
@@ -10911,18 +10776,8 @@
                 <w:sz w:val="28"/>
                 <w:szCs w:val="28"/>
               </w:rPr>
-              <w:t xml:space="preserve">Anna </w:t>
-            </w:r>
-            <w:proofErr w:type="spellStart"/>
-            <w:r>
-              <w:rPr>
-                <w:b/>
-                <w:sz w:val="28"/>
-                <w:szCs w:val="28"/>
-              </w:rPr>
-              <w:t>Suktam</w:t>
-            </w:r>
-            <w:proofErr w:type="spellEnd"/>
+              <w:t>Anna Suktam</w:t>
+            </w:r>
           </w:p>
           <w:p>
             <w:pPr>
@@ -10994,7 +10849,6 @@
               </w:rPr>
               <w:t>-</w:t>
             </w:r>
-            <w:proofErr w:type="spellStart"/>
             <w:r>
               <w:rPr>
                 <w:rFonts w:ascii="BRH Devanagari Extra" w:eastAsia="Times New Roman" w:hAnsi="BRH Devanagari Extra" w:cs="BRH Devanagari Extra"/>
@@ -11016,7 +10870,6 @@
               </w:rPr>
               <w:t>oÉliÉÉå</w:t>
             </w:r>
-            <w:proofErr w:type="spellEnd"/>
             <w:r>
               <w:rPr>
                 <w:rFonts w:ascii="BRH Malayalam Extra" w:eastAsia="Times New Roman" w:hAnsi="BRH Malayalam Extra" w:cs="BRH Devanagari Extra"/>
@@ -13550,17 +13403,7 @@
                 <w:sz w:val="40"/>
                 <w:szCs w:val="34"/>
               </w:rPr>
-              <w:t xml:space="preserve"> </w:t>
-            </w:r>
-            <w:proofErr w:type="spellStart"/>
-            <w:r>
-              <w:rPr>
-                <w:rFonts w:ascii="BRH Devanagari Extra" w:hAnsi="BRH Devanagari Extra" w:cs="BRH Devanagari Extra"/>
-                <w:color w:val="000000"/>
-                <w:sz w:val="40"/>
-                <w:szCs w:val="34"/>
-              </w:rPr>
-              <w:t>u</w:t>
+              <w:t xml:space="preserve"> u</w:t>
             </w:r>
             <w:r>
               <w:rPr>
@@ -13571,7 +13414,6 @@
               </w:rPr>
               <w:t>É</w:t>
             </w:r>
-            <w:proofErr w:type="spellEnd"/>
             <w:r>
               <w:rPr>
                 <w:rFonts w:ascii="BRH Malayalam Extra" w:hAnsi="BRH Malayalam Extra" w:cs="BRH Devanagari Extra"/>
@@ -13581,7 +13423,6 @@
               </w:rPr>
               <w:t>–</w:t>
             </w:r>
-            <w:proofErr w:type="spellStart"/>
             <w:r>
               <w:rPr>
                 <w:rFonts w:ascii="BRH Devanagari Extra" w:hAnsi="BRH Devanagari Extra" w:cs="BRH Devanagari Extra"/>
@@ -13591,7 +13432,7 @@
               </w:rPr>
               <w:t>Uç</w:t>
             </w:r>
-            <w:proofErr w:type="spellEnd"/>
+            <w:proofErr w:type="gramStart"/>
             <w:r>
               <w:rPr>
                 <w:rFonts w:ascii="BRH Malayalam Extra" w:hAnsi="BRH Malayalam Extra" w:cs="BRH Devanagari Extra"/>
@@ -13621,6 +13462,7 @@
               <w:t>wÉrÉþlirÉæ</w:t>
             </w:r>
             <w:proofErr w:type="spellEnd"/>
+            <w:proofErr w:type="gramEnd"/>
             <w:r>
               <w:rPr>
                 <w:rFonts w:ascii="BRH Malayalam Extra" w:hAnsi="BRH Malayalam Extra" w:cs="BRH Devanagari Extra"/>
@@ -13736,17 +13578,7 @@
                 <w:sz w:val="40"/>
                 <w:szCs w:val="34"/>
               </w:rPr>
-              <w:t xml:space="preserve"> </w:t>
-            </w:r>
-            <w:proofErr w:type="spellStart"/>
-            <w:r>
-              <w:rPr>
-                <w:rFonts w:ascii="BRH Devanagari Extra" w:hAnsi="BRH Devanagari Extra" w:cs="BRH Devanagari Extra"/>
-                <w:color w:val="000000"/>
-                <w:sz w:val="40"/>
-                <w:szCs w:val="34"/>
-              </w:rPr>
-              <w:t>u</w:t>
+              <w:t xml:space="preserve"> u</w:t>
             </w:r>
             <w:r>
               <w:rPr>
@@ -13757,7 +13589,6 @@
               </w:rPr>
               <w:t>É</w:t>
             </w:r>
-            <w:proofErr w:type="spellEnd"/>
             <w:r>
               <w:rPr>
                 <w:rFonts w:ascii="BRH Malayalam Extra" w:hAnsi="BRH Malayalam Extra" w:cs="BRH Devanagari Extra"/>
@@ -13767,7 +13598,6 @@
               </w:rPr>
               <w:t>–</w:t>
             </w:r>
-            <w:proofErr w:type="spellStart"/>
             <w:r>
               <w:rPr>
                 <w:rFonts w:ascii="BRH Devanagari Extra" w:hAnsi="BRH Devanagari Extra" w:cs="BRH Devanagari Extra"/>
@@ -13777,7 +13607,7 @@
               </w:rPr>
               <w:t>Uç</w:t>
             </w:r>
-            <w:proofErr w:type="spellEnd"/>
+            <w:proofErr w:type="gramStart"/>
             <w:r>
               <w:rPr>
                 <w:rFonts w:ascii="BRH Malayalam Extra" w:hAnsi="BRH Malayalam Extra" w:cs="BRH Devanagari Extra"/>
@@ -13807,6 +13637,7 @@
               <w:t>wÉrÉþlirÉæ</w:t>
             </w:r>
             <w:proofErr w:type="spellEnd"/>
+            <w:proofErr w:type="gramEnd"/>
             <w:r>
               <w:rPr>
                 <w:rFonts w:ascii="BRH Malayalam Extra" w:hAnsi="BRH Malayalam Extra" w:cs="BRH Devanagari Extra"/>
@@ -13934,7 +13765,6 @@
                 <w:szCs w:val="34"/>
               </w:rPr>
             </w:pPr>
-            <w:proofErr w:type="spellStart"/>
             <w:r>
               <w:rPr>
                 <w:rFonts w:ascii="BRH Devanagari Extra" w:hAnsi="BRH Devanagari Extra" w:cs="BRH Devanagari Extra"/>
@@ -13947,7 +13777,6 @@
               </w:rPr>
               <w:t>mÉ</w:t>
             </w:r>
-            <w:proofErr w:type="spellEnd"/>
             <w:r>
               <w:rPr>
                 <w:rFonts w:ascii="BRH Malayalam Extra" w:hAnsi="BRH Malayalam Extra" w:cs="BRH Devanagari Extra"/>
@@ -14083,7 +13912,6 @@
                 <w:szCs w:val="34"/>
               </w:rPr>
             </w:pPr>
-            <w:proofErr w:type="spellStart"/>
             <w:r>
               <w:rPr>
                 <w:rFonts w:ascii="BRH Devanagari Extra" w:hAnsi="BRH Devanagari Extra" w:cs="BRH Devanagari Extra"/>
@@ -14096,7 +13924,6 @@
               </w:rPr>
               <w:t>mÉ</w:t>
             </w:r>
-            <w:proofErr w:type="spellEnd"/>
             <w:r>
               <w:rPr>
                 <w:rFonts w:ascii="BRH Malayalam Extra" w:hAnsi="BRH Malayalam Extra" w:cs="BRH Devanagari Extra"/>
@@ -14272,7 +14099,6 @@
         </w:rPr>
         <w:br w:type="page"/>
       </w:r>
-      <w:proofErr w:type="spellStart"/>
       <w:r>
         <w:rPr>
           <w:b/>
@@ -14302,18 +14128,7 @@
           <w:szCs w:val="32"/>
           <w:u w:val="single"/>
         </w:rPr>
-        <w:t>a</w:t>
-      </w:r>
-      <w:proofErr w:type="spellEnd"/>
-      <w:r>
-        <w:rPr>
-          <w:b/>
-          <w:bCs/>
-          <w:sz w:val="32"/>
-          <w:szCs w:val="32"/>
-          <w:u w:val="single"/>
-        </w:rPr>
-        <w:t xml:space="preserve"> Shanti </w:t>
+        <w:t xml:space="preserve">a Shanti </w:t>
       </w:r>
       <w:r>
         <w:rPr>
@@ -15209,19 +15024,8 @@
                 <w:sz w:val="40"/>
                 <w:szCs w:val="34"/>
               </w:rPr>
-              <w:t xml:space="preserve"> </w:t>
-            </w:r>
-            <w:proofErr w:type="spellStart"/>
-            <w:r>
-              <w:rPr>
-                <w:rFonts w:ascii="BRH Devanagari Extra" w:hAnsi="BRH Devanagari Extra" w:cs="BRH Devanagari Extra"/>
-                <w:color w:val="000000"/>
-                <w:sz w:val="40"/>
-                <w:szCs w:val="34"/>
-              </w:rPr>
-              <w:t>rÉ</w:t>
-            </w:r>
-            <w:proofErr w:type="spellEnd"/>
+              <w:t xml:space="preserve"> rÉ</w:t>
+            </w:r>
             <w:r>
               <w:rPr>
                 <w:rFonts w:ascii="BRH Malayalam Extra" w:hAnsi="BRH Malayalam Extra" w:cs="BRH Devanagari Extra"/>
@@ -15393,19 +15197,8 @@
                 <w:sz w:val="40"/>
                 <w:szCs w:val="34"/>
               </w:rPr>
-              <w:t xml:space="preserve"> </w:t>
-            </w:r>
-            <w:proofErr w:type="spellStart"/>
-            <w:r>
-              <w:rPr>
-                <w:rFonts w:ascii="BRH Devanagari Extra" w:hAnsi="BRH Devanagari Extra" w:cs="BRH Devanagari Extra"/>
-                <w:color w:val="000000"/>
-                <w:sz w:val="40"/>
-                <w:szCs w:val="34"/>
-              </w:rPr>
-              <w:t>rÉ</w:t>
-            </w:r>
-            <w:proofErr w:type="spellEnd"/>
+              <w:t xml:space="preserve"> rÉ</w:t>
+            </w:r>
             <w:r>
               <w:rPr>
                 <w:rFonts w:ascii="BRH Malayalam Extra" w:hAnsi="BRH Malayalam Extra" w:cs="BRH Devanagari Extra"/>
@@ -15651,19 +15444,8 @@
                 <w:sz w:val="40"/>
                 <w:szCs w:val="34"/>
               </w:rPr>
-              <w:t xml:space="preserve"> </w:t>
-            </w:r>
-            <w:proofErr w:type="spellStart"/>
-            <w:r>
-              <w:rPr>
-                <w:rFonts w:ascii="BRH Devanagari Extra" w:hAnsi="BRH Devanagari Extra" w:cs="BRH Devanagari Extra"/>
-                <w:color w:val="000000"/>
-                <w:sz w:val="40"/>
-                <w:szCs w:val="34"/>
-              </w:rPr>
-              <w:t>uÉ</w:t>
-            </w:r>
-            <w:proofErr w:type="spellEnd"/>
+              <w:t xml:space="preserve"> uÉ</w:t>
+            </w:r>
             <w:r>
               <w:rPr>
                 <w:rFonts w:ascii="BRH Malayalam Extra" w:hAnsi="BRH Malayalam Extra" w:cs="BRH Devanagari Extra"/>
@@ -15844,19 +15626,8 @@
                 <w:sz w:val="40"/>
                 <w:szCs w:val="34"/>
               </w:rPr>
-              <w:t xml:space="preserve"> </w:t>
-            </w:r>
-            <w:proofErr w:type="spellStart"/>
-            <w:r>
-              <w:rPr>
-                <w:rFonts w:ascii="BRH Devanagari Extra" w:hAnsi="BRH Devanagari Extra" w:cs="BRH Devanagari Extra"/>
-                <w:color w:val="000000"/>
-                <w:sz w:val="40"/>
-                <w:szCs w:val="34"/>
-              </w:rPr>
-              <w:t>uÉ</w:t>
-            </w:r>
-            <w:proofErr w:type="spellEnd"/>
+              <w:t xml:space="preserve"> uÉ</w:t>
+            </w:r>
             <w:r>
               <w:rPr>
                 <w:rFonts w:ascii="BRH Malayalam Extra" w:hAnsi="BRH Malayalam Extra" w:cs="BRH Devanagari Extra"/>
@@ -16034,40 +15805,17 @@
                 <w:szCs w:val="34"/>
                 <w:highlight w:val="yellow"/>
               </w:rPr>
-              <w:t xml:space="preserve"> </w:t>
-            </w:r>
-            <w:proofErr w:type="spellStart"/>
-            <w:r>
-              <w:rPr>
-                <w:rFonts w:ascii="BRH Devanagari Extra" w:hAnsi="BRH Devanagari Extra" w:cs="BRH Devanagari Extra"/>
-                <w:color w:val="000000"/>
-                <w:sz w:val="40"/>
-                <w:szCs w:val="34"/>
-                <w:highlight w:val="yellow"/>
-              </w:rPr>
-              <w:t>lÉ</w:t>
-            </w:r>
-            <w:proofErr w:type="spellEnd"/>
-            <w:r>
-              <w:rPr>
-                <w:rFonts w:ascii="BRH Devanagari Extra" w:hAnsi="BRH Devanagari Extra" w:cs="BRH Devanagari Extra"/>
-                <w:color w:val="000000"/>
-                <w:sz w:val="40"/>
-                <w:szCs w:val="34"/>
-              </w:rPr>
-              <w:t xml:space="preserve"> </w:t>
-            </w:r>
-            <w:proofErr w:type="spellStart"/>
-            <w:r>
-              <w:rPr>
-                <w:rFonts w:ascii="BRH Devanagari Extra" w:hAnsi="BRH Devanagari Extra" w:cs="BRH Devanagari Extra"/>
-                <w:color w:val="000000"/>
-                <w:sz w:val="40"/>
-                <w:szCs w:val="34"/>
-              </w:rPr>
-              <w:t>mÉ</w:t>
-            </w:r>
-            <w:proofErr w:type="spellEnd"/>
+              <w:t xml:space="preserve"> lÉ</w:t>
+            </w:r>
+            <w:r>
+              <w:rPr>
+                <w:rFonts w:ascii="BRH Devanagari Extra" w:hAnsi="BRH Devanagari Extra" w:cs="BRH Devanagari Extra"/>
+                <w:color w:val="000000"/>
+                <w:sz w:val="40"/>
+                <w:szCs w:val="34"/>
+              </w:rPr>
+              <w:t xml:space="preserve"> mÉ</w:t>
+            </w:r>
             <w:r>
               <w:rPr>
                 <w:rFonts w:ascii="BRH Malayalam Extra" w:hAnsi="BRH Malayalam Extra" w:cs="BRH Devanagari Extra"/>
@@ -16184,40 +15932,17 @@
                 <w:szCs w:val="34"/>
                 <w:highlight w:val="green"/>
               </w:rPr>
-              <w:t xml:space="preserve"> </w:t>
-            </w:r>
-            <w:proofErr w:type="spellStart"/>
-            <w:r>
-              <w:rPr>
-                <w:rFonts w:ascii="BRH Devanagari Extra" w:hAnsi="BRH Devanagari Extra" w:cs="BRH Devanagari Extra"/>
-                <w:color w:val="000000"/>
-                <w:sz w:val="40"/>
-                <w:szCs w:val="34"/>
-                <w:highlight w:val="green"/>
-              </w:rPr>
-              <w:t>lÉ</w:t>
-            </w:r>
-            <w:proofErr w:type="spellEnd"/>
-            <w:r>
-              <w:rPr>
-                <w:rFonts w:ascii="BRH Devanagari Extra" w:hAnsi="BRH Devanagari Extra" w:cs="BRH Devanagari Extra"/>
-                <w:color w:val="000000"/>
-                <w:sz w:val="40"/>
-                <w:szCs w:val="34"/>
-              </w:rPr>
-              <w:t xml:space="preserve"> </w:t>
-            </w:r>
-            <w:proofErr w:type="spellStart"/>
-            <w:r>
-              <w:rPr>
-                <w:rFonts w:ascii="BRH Devanagari Extra" w:hAnsi="BRH Devanagari Extra" w:cs="BRH Devanagari Extra"/>
-                <w:color w:val="000000"/>
-                <w:sz w:val="40"/>
-                <w:szCs w:val="34"/>
-              </w:rPr>
-              <w:t>mÉ</w:t>
-            </w:r>
-            <w:proofErr w:type="spellEnd"/>
+              <w:t xml:space="preserve"> lÉ</w:t>
+            </w:r>
+            <w:r>
+              <w:rPr>
+                <w:rFonts w:ascii="BRH Devanagari Extra" w:hAnsi="BRH Devanagari Extra" w:cs="BRH Devanagari Extra"/>
+                <w:color w:val="000000"/>
+                <w:sz w:val="40"/>
+                <w:szCs w:val="34"/>
+              </w:rPr>
+              <w:t xml:space="preserve"> mÉ</w:t>
+            </w:r>
             <w:r>
               <w:rPr>
                 <w:rFonts w:ascii="BRH Malayalam Extra" w:hAnsi="BRH Malayalam Extra" w:cs="BRH Devanagari Extra"/>
@@ -16443,25 +16168,14 @@
               </w:rPr>
               <w:t>–</w:t>
             </w:r>
-            <w:proofErr w:type="spellStart"/>
-            <w:r>
-              <w:rPr>
-                <w:rFonts w:ascii="BRH Devanagari Extra" w:hAnsi="BRH Devanagari Extra" w:cs="BRH Devanagari Extra"/>
-                <w:color w:val="000000"/>
-                <w:sz w:val="40"/>
-                <w:szCs w:val="34"/>
-              </w:rPr>
-              <w:t>iÉ</w:t>
-            </w:r>
-            <w:proofErr w:type="spellEnd"/>
-            <w:r>
-              <w:rPr>
-                <w:rFonts w:ascii="BRH Devanagari Extra" w:hAnsi="BRH Devanagari Extra" w:cs="BRH Devanagari Extra"/>
-                <w:color w:val="000000"/>
-                <w:sz w:val="40"/>
-                <w:szCs w:val="34"/>
-              </w:rPr>
-              <w:t xml:space="preserve"> Â</w:t>
+            <w:r>
+              <w:rPr>
+                <w:rFonts w:ascii="BRH Devanagari Extra" w:hAnsi="BRH Devanagari Extra" w:cs="BRH Devanagari Extra"/>
+                <w:color w:val="000000"/>
+                <w:sz w:val="40"/>
+                <w:szCs w:val="34"/>
+              </w:rPr>
+              <w:t>iÉ Â</w:t>
             </w:r>
             <w:r>
               <w:rPr>
@@ -16636,25 +16350,14 @@
               </w:rPr>
               <w:t>–</w:t>
             </w:r>
-            <w:proofErr w:type="spellStart"/>
-            <w:r>
-              <w:rPr>
-                <w:rFonts w:ascii="BRH Devanagari Extra" w:hAnsi="BRH Devanagari Extra" w:cs="BRH Devanagari Extra"/>
-                <w:color w:val="000000"/>
-                <w:sz w:val="40"/>
-                <w:szCs w:val="34"/>
-              </w:rPr>
-              <w:t>iÉ</w:t>
-            </w:r>
-            <w:proofErr w:type="spellEnd"/>
-            <w:r>
-              <w:rPr>
-                <w:rFonts w:ascii="BRH Devanagari Extra" w:hAnsi="BRH Devanagari Extra" w:cs="BRH Devanagari Extra"/>
-                <w:color w:val="000000"/>
-                <w:sz w:val="40"/>
-                <w:szCs w:val="34"/>
-              </w:rPr>
-              <w:t xml:space="preserve"> Â</w:t>
+            <w:r>
+              <w:rPr>
+                <w:rFonts w:ascii="BRH Devanagari Extra" w:hAnsi="BRH Devanagari Extra" w:cs="BRH Devanagari Extra"/>
+                <w:color w:val="000000"/>
+                <w:sz w:val="40"/>
+                <w:szCs w:val="34"/>
+              </w:rPr>
+              <w:t>iÉ Â</w:t>
             </w:r>
             <w:r>
               <w:rPr>
@@ -17078,7 +16781,6 @@
                 <w:lang w:eastAsia="en-IN" w:bidi="ml-IN"/>
               </w:rPr>
             </w:pPr>
-            <w:proofErr w:type="spellStart"/>
             <w:r>
               <w:rPr>
                 <w:rFonts w:ascii="BRH Devanagari Extra" w:eastAsia="Times New Roman" w:hAnsi="BRH Devanagari Extra" w:cs="BRH Devanagari Extra"/>
@@ -17089,7 +16791,6 @@
               </w:rPr>
               <w:t>cÉ</w:t>
             </w:r>
-            <w:proofErr w:type="spellEnd"/>
             <w:r>
               <w:rPr>
                 <w:rFonts w:ascii="BRH Malayalam Extra" w:eastAsia="Times New Roman" w:hAnsi="BRH Malayalam Extra" w:cs="BRH Devanagari Extra"/>
@@ -17318,7 +17019,6 @@
                 <w:lang w:eastAsia="en-IN" w:bidi="ml-IN"/>
               </w:rPr>
             </w:pPr>
-            <w:proofErr w:type="spellStart"/>
             <w:r>
               <w:rPr>
                 <w:rFonts w:ascii="BRH Devanagari Extra" w:eastAsia="Times New Roman" w:hAnsi="BRH Devanagari Extra" w:cs="BRH Devanagari Extra"/>
@@ -17329,7 +17029,6 @@
               </w:rPr>
               <w:t>cÉ</w:t>
             </w:r>
-            <w:proofErr w:type="spellEnd"/>
             <w:r>
               <w:rPr>
                 <w:rFonts w:ascii="BRH Malayalam Extra" w:eastAsia="Times New Roman" w:hAnsi="BRH Malayalam Extra" w:cs="BRH Devanagari Extra"/>
@@ -18557,7 +18256,6 @@
           <w:u w:val="single"/>
         </w:rPr>
       </w:pPr>
-      <w:proofErr w:type="spellStart"/>
       <w:r>
         <w:rPr>
           <w:b/>
@@ -18567,18 +18265,7 @@
           <w:u w:val="single"/>
         </w:rPr>
         <w:lastRenderedPageBreak/>
-        <w:t>Udaka</w:t>
-      </w:r>
-      <w:proofErr w:type="spellEnd"/>
-      <w:r>
-        <w:rPr>
-          <w:b/>
-          <w:bCs/>
-          <w:sz w:val="32"/>
-          <w:szCs w:val="32"/>
-          <w:u w:val="single"/>
-        </w:rPr>
-        <w:t xml:space="preserve"> Shanti Sanskrit Corrections –Observed till 31st March 2019</w:t>
+        <w:t>Udaka Shanti Sanskrit Corrections –Observed till 31st March 2019</w:t>
       </w:r>
     </w:p>
     <w:p>
@@ -19407,20 +19094,8 @@
                 <w:sz w:val="40"/>
                 <w:szCs w:val="34"/>
               </w:rPr>
-              <w:t xml:space="preserve"> </w:t>
-            </w:r>
-            <w:proofErr w:type="spellStart"/>
-            <w:r>
-              <w:rPr>
-                <w:rFonts w:ascii="BRH Devanagari Extra" w:hAnsi="BRH Devanagari Extra" w:cs="BRH Devanagari Extra"/>
-                <w:bCs/>
-                <w:color w:val="000000"/>
-                <w:sz w:val="40"/>
-                <w:szCs w:val="34"/>
-              </w:rPr>
-              <w:t>uÉ</w:t>
-            </w:r>
-            <w:proofErr w:type="spellEnd"/>
+              <w:t xml:space="preserve"> uÉ</w:t>
+            </w:r>
             <w:r>
               <w:rPr>
                 <w:rFonts w:ascii="BRH Malayalam Extra" w:hAnsi="BRH Malayalam Extra" w:cs="BRH Devanagari Extra"/>
@@ -19601,20 +19276,8 @@
                 <w:sz w:val="40"/>
                 <w:szCs w:val="34"/>
               </w:rPr>
-              <w:t xml:space="preserve"> </w:t>
-            </w:r>
-            <w:proofErr w:type="spellStart"/>
-            <w:r>
-              <w:rPr>
-                <w:rFonts w:ascii="BRH Devanagari Extra" w:hAnsi="BRH Devanagari Extra" w:cs="BRH Devanagari Extra"/>
-                <w:bCs/>
-                <w:color w:val="000000"/>
-                <w:sz w:val="40"/>
-                <w:szCs w:val="34"/>
-              </w:rPr>
-              <w:t>uÉ</w:t>
-            </w:r>
-            <w:proofErr w:type="spellEnd"/>
+              <w:t xml:space="preserve"> uÉ</w:t>
+            </w:r>
             <w:r>
               <w:rPr>
                 <w:rFonts w:ascii="BRH Malayalam Extra" w:hAnsi="BRH Malayalam Extra" w:cs="BRH Devanagari Extra"/>
@@ -19732,27 +19395,15 @@
                 <w:szCs w:val="32"/>
               </w:rPr>
             </w:pPr>
-            <w:proofErr w:type="spellStart"/>
-            <w:r>
-              <w:rPr>
-                <w:rFonts w:ascii="BRH Devanagari Extra" w:hAnsi="BRH Devanagari Extra" w:cs="BRH Devanagari Extra"/>
-                <w:bCs/>
-                <w:color w:val="000000"/>
-                <w:sz w:val="40"/>
-                <w:szCs w:val="34"/>
-              </w:rPr>
-              <w:t>cÉ</w:t>
-            </w:r>
-            <w:proofErr w:type="spellEnd"/>
-            <w:r>
-              <w:rPr>
-                <w:rFonts w:ascii="BRH Devanagari Extra" w:hAnsi="BRH Devanagari Extra" w:cs="BRH Devanagari Extra"/>
-                <w:bCs/>
-                <w:color w:val="000000"/>
-                <w:sz w:val="40"/>
-                <w:szCs w:val="34"/>
-              </w:rPr>
-              <w:t xml:space="preserve"> </w:t>
+            <w:r>
+              <w:rPr>
+                <w:rFonts w:ascii="BRH Devanagari Extra" w:hAnsi="BRH Devanagari Extra" w:cs="BRH Devanagari Extra"/>
+                <w:bCs/>
+                <w:color w:val="000000"/>
+                <w:sz w:val="40"/>
+                <w:szCs w:val="34"/>
+              </w:rPr>
+              <w:t xml:space="preserve">cÉ </w:t>
             </w:r>
             <w:proofErr w:type="spellStart"/>
             <w:r>
@@ -19846,27 +19497,15 @@
                 <w:szCs w:val="32"/>
               </w:rPr>
             </w:pPr>
-            <w:proofErr w:type="spellStart"/>
-            <w:r>
-              <w:rPr>
-                <w:rFonts w:ascii="BRH Devanagari Extra" w:hAnsi="BRH Devanagari Extra" w:cs="BRH Devanagari Extra"/>
-                <w:bCs/>
-                <w:color w:val="000000"/>
-                <w:sz w:val="40"/>
-                <w:szCs w:val="34"/>
-              </w:rPr>
-              <w:t>cÉ</w:t>
-            </w:r>
-            <w:proofErr w:type="spellEnd"/>
-            <w:r>
-              <w:rPr>
-                <w:rFonts w:ascii="BRH Devanagari Extra" w:hAnsi="BRH Devanagari Extra" w:cs="BRH Devanagari Extra"/>
-                <w:bCs/>
-                <w:color w:val="000000"/>
-                <w:sz w:val="40"/>
-                <w:szCs w:val="34"/>
-              </w:rPr>
-              <w:t xml:space="preserve"> </w:t>
+            <w:r>
+              <w:rPr>
+                <w:rFonts w:ascii="BRH Devanagari Extra" w:hAnsi="BRH Devanagari Extra" w:cs="BRH Devanagari Extra"/>
+                <w:bCs/>
+                <w:color w:val="000000"/>
+                <w:sz w:val="40"/>
+                <w:szCs w:val="34"/>
+              </w:rPr>
+              <w:t xml:space="preserve">cÉ </w:t>
             </w:r>
             <w:proofErr w:type="spellStart"/>
             <w:r>
@@ -20071,15 +19710,27 @@
               </w:rPr>
               <w:t>–</w:t>
             </w:r>
-            <w:r>
-              <w:rPr>
-                <w:rFonts w:ascii="BRH Devanagari Extra" w:hAnsi="BRH Devanagari Extra" w:cs="BRH Devanagari Extra"/>
-                <w:bCs/>
-                <w:color w:val="000000"/>
-                <w:sz w:val="40"/>
-                <w:szCs w:val="34"/>
-              </w:rPr>
-              <w:t xml:space="preserve">ÇmÉÉ </w:t>
+            <w:proofErr w:type="spellStart"/>
+            <w:r>
+              <w:rPr>
+                <w:rFonts w:ascii="BRH Devanagari Extra" w:hAnsi="BRH Devanagari Extra" w:cs="BRH Devanagari Extra"/>
+                <w:bCs/>
+                <w:color w:val="000000"/>
+                <w:sz w:val="40"/>
+                <w:szCs w:val="34"/>
+              </w:rPr>
+              <w:t>ÇmÉÉ</w:t>
+            </w:r>
+            <w:proofErr w:type="spellEnd"/>
+            <w:r>
+              <w:rPr>
+                <w:rFonts w:ascii="BRH Devanagari Extra" w:hAnsi="BRH Devanagari Extra" w:cs="BRH Devanagari Extra"/>
+                <w:bCs/>
+                <w:color w:val="000000"/>
+                <w:sz w:val="40"/>
+                <w:szCs w:val="34"/>
+              </w:rPr>
+              <w:t xml:space="preserve"> </w:t>
             </w:r>
             <w:proofErr w:type="spellStart"/>
             <w:r>
@@ -20162,7 +19813,6 @@
                 <w:szCs w:val="34"/>
               </w:rPr>
             </w:pPr>
-            <w:proofErr w:type="spellStart"/>
             <w:r>
               <w:rPr>
                 <w:rFonts w:ascii="BRH Devanagari Extra" w:hAnsi="BRH Devanagari Extra" w:cs="BRH Devanagari Extra"/>
@@ -20174,7 +19824,6 @@
               </w:rPr>
               <w:t>ÌlÉ</w:t>
             </w:r>
-            <w:proofErr w:type="spellEnd"/>
             <w:r>
               <w:rPr>
                 <w:rFonts w:ascii="BRH Malayalam Extra" w:hAnsi="BRH Malayalam Extra" w:cs="BRH Devanagari Extra"/>
@@ -20209,15 +19858,27 @@
               </w:rPr>
               <w:t>–</w:t>
             </w:r>
-            <w:r>
-              <w:rPr>
-                <w:rFonts w:ascii="BRH Devanagari Extra" w:hAnsi="BRH Devanagari Extra" w:cs="BRH Devanagari Extra"/>
-                <w:bCs/>
-                <w:color w:val="000000"/>
-                <w:sz w:val="40"/>
-                <w:szCs w:val="34"/>
-              </w:rPr>
-              <w:t xml:space="preserve">ÇmÉÉ </w:t>
+            <w:proofErr w:type="spellStart"/>
+            <w:r>
+              <w:rPr>
+                <w:rFonts w:ascii="BRH Devanagari Extra" w:hAnsi="BRH Devanagari Extra" w:cs="BRH Devanagari Extra"/>
+                <w:bCs/>
+                <w:color w:val="000000"/>
+                <w:sz w:val="40"/>
+                <w:szCs w:val="34"/>
+              </w:rPr>
+              <w:t>ÇmÉÉ</w:t>
+            </w:r>
+            <w:proofErr w:type="spellEnd"/>
+            <w:r>
+              <w:rPr>
+                <w:rFonts w:ascii="BRH Devanagari Extra" w:hAnsi="BRH Devanagari Extra" w:cs="BRH Devanagari Extra"/>
+                <w:bCs/>
+                <w:color w:val="000000"/>
+                <w:sz w:val="40"/>
+                <w:szCs w:val="34"/>
+              </w:rPr>
+              <w:t xml:space="preserve"> </w:t>
             </w:r>
             <w:proofErr w:type="spellStart"/>
             <w:r>
@@ -21163,7 +20824,6 @@
         </w:rPr>
         <w:br w:type="page"/>
       </w:r>
-      <w:proofErr w:type="spellStart"/>
       <w:r>
         <w:rPr>
           <w:b/>
@@ -21173,18 +20833,7 @@
           <w:u w:val="single"/>
         </w:rPr>
         <w:lastRenderedPageBreak/>
-        <w:t>Udaka</w:t>
-      </w:r>
-      <w:proofErr w:type="spellEnd"/>
-      <w:r>
-        <w:rPr>
-          <w:b/>
-          <w:bCs/>
-          <w:sz w:val="32"/>
-          <w:szCs w:val="32"/>
-          <w:u w:val="single"/>
-        </w:rPr>
-        <w:t xml:space="preserve"> Shanti Sanskrit Corrections –Observed till 31st October 2018</w:t>
+        <w:t>Udaka Shanti Sanskrit Corrections –Observed till 31st October 2018</w:t>
       </w:r>
     </w:p>
     <w:p>
@@ -21901,7 +21550,6 @@
         </w:rPr>
         <w:br w:type="page"/>
       </w:r>
-      <w:proofErr w:type="spellStart"/>
       <w:r>
         <w:rPr>
           <w:b/>
@@ -21931,18 +21579,7 @@
           <w:szCs w:val="32"/>
           <w:u w:val="single"/>
         </w:rPr>
-        <w:t>a</w:t>
-      </w:r>
-      <w:proofErr w:type="spellEnd"/>
-      <w:r>
-        <w:rPr>
-          <w:b/>
-          <w:bCs/>
-          <w:sz w:val="32"/>
-          <w:szCs w:val="32"/>
-          <w:u w:val="single"/>
-        </w:rPr>
-        <w:t xml:space="preserve"> Shanti Sanskrit Corrections –Observed till 31st July 2018</w:t>
+        <w:t>a Shanti Sanskrit Corrections –Observed till 31st July 2018</w:t>
       </w:r>
     </w:p>
     <w:p>
@@ -22588,7 +22225,6 @@
               </w:rPr>
               <w:t>–</w:t>
             </w:r>
-            <w:proofErr w:type="spellStart"/>
             <w:r>
               <w:rPr>
                 <w:rFonts w:ascii="BRH Devanagari Extra" w:hAnsi="BRH Devanagari Extra" w:cs="BRH Devanagari Extra"/>
@@ -22598,7 +22234,6 @@
               </w:rPr>
               <w:t>óè</w:t>
             </w:r>
-            <w:proofErr w:type="spellEnd"/>
             <w:r>
               <w:rPr>
                 <w:rFonts w:ascii="BRH Malayalam Extra" w:hAnsi="BRH Malayalam Extra" w:cs="BRH Devanagari Extra"/>
@@ -22751,7 +22386,6 @@
               </w:rPr>
               <w:t>–</w:t>
             </w:r>
-            <w:proofErr w:type="spellStart"/>
             <w:r>
               <w:rPr>
                 <w:rFonts w:ascii="BRH Devanagari Extra" w:hAnsi="BRH Devanagari Extra" w:cs="BRH Devanagari Extra"/>
@@ -22761,7 +22395,6 @@
               </w:rPr>
               <w:t>óè</w:t>
             </w:r>
-            <w:proofErr w:type="spellEnd"/>
             <w:r>
               <w:rPr>
                 <w:rFonts w:ascii="BRH Malayalam Extra" w:hAnsi="BRH Malayalam Extra" w:cs="BRH Devanagari Extra"/>
@@ -25286,8 +24919,36 @@
                 <w:sz w:val="28"/>
                 <w:szCs w:val="28"/>
               </w:rPr>
-              <w:t>Section 1.40  Item Heading  33</w:t>
-            </w:r>
+              <w:t xml:space="preserve">Section </w:t>
+            </w:r>
+            <w:proofErr w:type="gramStart"/>
+            <w:r>
+              <w:rPr>
+                <w:bCs/>
+                <w:sz w:val="28"/>
+                <w:szCs w:val="28"/>
+              </w:rPr>
+              <w:t>1.40  Item</w:t>
+            </w:r>
+            <w:proofErr w:type="gramEnd"/>
+            <w:r>
+              <w:rPr>
+                <w:bCs/>
+                <w:sz w:val="28"/>
+                <w:szCs w:val="28"/>
+              </w:rPr>
+              <w:t xml:space="preserve"> </w:t>
+            </w:r>
+            <w:proofErr w:type="gramStart"/>
+            <w:r>
+              <w:rPr>
+                <w:bCs/>
+                <w:sz w:val="28"/>
+                <w:szCs w:val="28"/>
+              </w:rPr>
+              <w:t>Heading  33</w:t>
+            </w:r>
+            <w:proofErr w:type="gramEnd"/>
           </w:p>
         </w:tc>
         <w:tc>
@@ -27475,6 +27136,7 @@
               <w:br/>
             </w:r>
             <w:proofErr w:type="spellStart"/>
+            <w:proofErr w:type="gramStart"/>
             <w:r>
               <w:rPr>
                 <w:rFonts w:ascii="BRH Devanagari Extra" w:hAnsi="BRH Devanagari Extra" w:cs="BRH Devanagari Extra"/>
@@ -27532,6 +27194,7 @@
               </w:rPr>
               <w:t>|</w:t>
             </w:r>
+            <w:proofErr w:type="gramEnd"/>
             <w:r>
               <w:rPr>
                 <w:rFonts w:ascii="BRH Tamil Tab Extra" w:hAnsi="BRH Tamil Tab Extra" w:cs="BRH Tamil Tab Extra"/>
@@ -28950,23 +28613,7 @@
                 <w:sz w:val="32"/>
                 <w:szCs w:val="32"/>
               </w:rPr>
-              <w:t xml:space="preserve">1.31 Brahma </w:t>
-            </w:r>
-            <w:proofErr w:type="spellStart"/>
-            <w:r>
-              <w:rPr>
-                <w:sz w:val="32"/>
-                <w:szCs w:val="32"/>
-              </w:rPr>
-              <w:t>Suktam</w:t>
-            </w:r>
-            <w:proofErr w:type="spellEnd"/>
-            <w:r>
-              <w:rPr>
-                <w:sz w:val="32"/>
-                <w:szCs w:val="32"/>
-              </w:rPr>
-              <w:t xml:space="preserve"> Para 70</w:t>
+              <w:t>1.31 Brahma Suktam Para 70</w:t>
             </w:r>
           </w:p>
         </w:tc>
@@ -29664,23 +29311,7 @@
                 <w:szCs w:val="32"/>
               </w:rPr>
               <w:lastRenderedPageBreak/>
-              <w:t xml:space="preserve">1.36 Nakshatra </w:t>
-            </w:r>
-            <w:proofErr w:type="spellStart"/>
-            <w:r>
-              <w:rPr>
-                <w:sz w:val="32"/>
-                <w:szCs w:val="32"/>
-              </w:rPr>
-              <w:t>Suktam</w:t>
-            </w:r>
-            <w:proofErr w:type="spellEnd"/>
-            <w:r>
-              <w:rPr>
-                <w:sz w:val="32"/>
-                <w:szCs w:val="32"/>
-              </w:rPr>
-              <w:t xml:space="preserve"> para 102 last line (star 23)</w:t>
+              <w:t>1.36 Nakshatra Suktam para 102 last line (star 23)</w:t>
             </w:r>
             <w:r>
               <w:rPr>
@@ -30328,6 +29959,7 @@
               <w:t xml:space="preserve"> </w:t>
             </w:r>
             <w:proofErr w:type="spellStart"/>
+            <w:proofErr w:type="gramStart"/>
             <w:r>
               <w:rPr>
                 <w:rFonts w:ascii="BRH Devanagari Extra" w:hAnsi="BRH Devanagari Extra" w:cs="BRH Devanagari Extra"/>
@@ -30405,6 +30037,7 @@
               <w:t>ÉýWûÏqÉÔýwÉÑ</w:t>
             </w:r>
             <w:proofErr w:type="spellEnd"/>
+            <w:proofErr w:type="gramEnd"/>
             <w:r>
               <w:rPr>
                 <w:rFonts w:ascii="BRH Devanagari Extra" w:hAnsi="BRH Devanagari Extra" w:cs="BRH Devanagari Extra"/>
@@ -30491,23 +30124,7 @@
                 <w:sz w:val="32"/>
                 <w:szCs w:val="32"/>
               </w:rPr>
-              <w:t xml:space="preserve">1.38 Varuna </w:t>
-            </w:r>
-            <w:proofErr w:type="spellStart"/>
-            <w:r>
-              <w:rPr>
-                <w:sz w:val="32"/>
-                <w:szCs w:val="32"/>
-              </w:rPr>
-              <w:t>Suktam</w:t>
-            </w:r>
-            <w:proofErr w:type="spellEnd"/>
-            <w:r>
-              <w:rPr>
-                <w:sz w:val="32"/>
-                <w:szCs w:val="32"/>
-              </w:rPr>
-              <w:t xml:space="preserve"> line 4</w:t>
+              <w:t>1.38 Varuna Suktam line 4</w:t>
             </w:r>
           </w:p>
         </w:tc>
@@ -30906,7 +30523,7 @@
 </file>
 
 <file path=word/endnotes.xml><?xml version="1.0" encoding="utf-8"?>
-<w:endnotes xmlns:wpc="http://schemas.microsoft.com/office/word/2010/wordprocessingCanvas" xmlns:cx="http://schemas.microsoft.com/office/drawing/2014/chartex" xmlns:cx1="http://schemas.microsoft.com/office/drawing/2015/9/8/chartex" xmlns:cx2="http://schemas.microsoft.com/office/drawing/2015/10/21/chartex" xmlns:cx3="http://schemas.microsoft.com/office/drawing/2016/5/9/chartex" xmlns:cx4="http://schemas.microsoft.com/office/drawing/2016/5/10/chartex" xmlns:cx5="http://schemas.microsoft.com/office/drawing/2016/5/11/chartex" xmlns:cx6="http://schemas.microsoft.com/office/drawing/2016/5/12/chartex" xmlns:cx7="http://schemas.microsoft.com/office/drawing/2016/5/13/chartex" xmlns:cx8="http://schemas.microsoft.com/office/drawing/2016/5/14/chartex" xmlns:mc="http://schemas.openxmlformats.org/markup-compatibility/2006" xmlns:aink="http://schemas.microsoft.com/office/drawing/2016/ink" xmlns:am3d="http://schemas.microsoft.com/office/drawing/2017/model3d" xmlns:o="urn:schemas-microsoft-com:office:office" xmlns:oel="http://schemas.microsoft.com/office/2019/extlst" xmlns:r="http://schemas.openxmlformats.org/officeDocument/2006/relationships" xmlns:m="http://schemas.openxmlformats.org/officeDocument/2006/math" xmlns:v="urn:schemas-microsoft-com:vml" xmlns:wp14="http://schemas.microsoft.com/office/word/2010/wordprocessingDrawing" xmlns:wp="http://schemas.openxmlformats.org/drawingml/2006/wordprocessingDrawing" xmlns:w10="urn:schemas-microsoft-com:office:word" xmlns:w="http://schemas.openxmlformats.org/wordprocessingml/2006/main" xmlns:w14="http://schemas.microsoft.com/office/word/2010/wordml" xmlns:w15="http://schemas.microsoft.com/office/word/2012/wordml" xmlns:w16cex="http://schemas.microsoft.com/office/word/2018/wordml/cex" xmlns:w16cid="http://schemas.microsoft.com/office/word/2016/wordml/cid" xmlns:w16="http://schemas.microsoft.com/office/word/2018/wordml" xmlns:w16sdtdh="http://schemas.microsoft.com/office/word/2020/wordml/sdtdatahash" xmlns:w16se="http://schemas.microsoft.com/office/word/2015/wordml/symex" xmlns:wpg="http://schemas.microsoft.com/office/word/2010/wordprocessingGroup" xmlns:wpi="http://schemas.microsoft.com/office/word/2010/wordprocessingInk" xmlns:wne="http://schemas.microsoft.com/office/word/2006/wordml" xmlns:wps="http://schemas.microsoft.com/office/word/2010/wordprocessingShape" mc:Ignorable="w14 w15 w16se w16cid w16 w16cex w16sdtdh wp14">
+<w:endnotes xmlns:wpc="http://schemas.microsoft.com/office/word/2010/wordprocessingCanvas" xmlns:cx="http://schemas.microsoft.com/office/drawing/2014/chartex" xmlns:cx1="http://schemas.microsoft.com/office/drawing/2015/9/8/chartex" xmlns:cx2="http://schemas.microsoft.com/office/drawing/2015/10/21/chartex" xmlns:cx3="http://schemas.microsoft.com/office/drawing/2016/5/9/chartex" xmlns:cx4="http://schemas.microsoft.com/office/drawing/2016/5/10/chartex" xmlns:cx5="http://schemas.microsoft.com/office/drawing/2016/5/11/chartex" xmlns:cx6="http://schemas.microsoft.com/office/drawing/2016/5/12/chartex" xmlns:cx7="http://schemas.microsoft.com/office/drawing/2016/5/13/chartex" xmlns:cx8="http://schemas.microsoft.com/office/drawing/2016/5/14/chartex" xmlns:mc="http://schemas.openxmlformats.org/markup-compatibility/2006" xmlns:aink="http://schemas.microsoft.com/office/drawing/2016/ink" xmlns:am3d="http://schemas.microsoft.com/office/drawing/2017/model3d" xmlns:o="urn:schemas-microsoft-com:office:office" xmlns:oel="http://schemas.microsoft.com/office/2019/extlst" xmlns:r="http://schemas.openxmlformats.org/officeDocument/2006/relationships" xmlns:m="http://schemas.openxmlformats.org/officeDocument/2006/math" xmlns:v="urn:schemas-microsoft-com:vml" xmlns:wp14="http://schemas.microsoft.com/office/word/2010/wordprocessingDrawing" xmlns:wp="http://schemas.openxmlformats.org/drawingml/2006/wordprocessingDrawing" xmlns:w10="urn:schemas-microsoft-com:office:word" xmlns:w="http://schemas.openxmlformats.org/wordprocessingml/2006/main" xmlns:w14="http://schemas.microsoft.com/office/word/2010/wordml" xmlns:w15="http://schemas.microsoft.com/office/word/2012/wordml" xmlns:w16cex="http://schemas.microsoft.com/office/word/2018/wordml/cex" xmlns:w16cid="http://schemas.microsoft.com/office/word/2016/wordml/cid" xmlns:w16="http://schemas.microsoft.com/office/word/2018/wordml" xmlns:w16du="http://schemas.microsoft.com/office/word/2023/wordml/word16du" xmlns:w16sdtdh="http://schemas.microsoft.com/office/word/2020/wordml/sdtdatahash" xmlns:w16sdtfl="http://schemas.microsoft.com/office/word/2024/wordml/sdtformatlock" xmlns:w16se="http://schemas.microsoft.com/office/word/2015/wordml/symex" xmlns:wpg="http://schemas.microsoft.com/office/word/2010/wordprocessingGroup" xmlns:wpi="http://schemas.microsoft.com/office/word/2010/wordprocessingInk" xmlns:wne="http://schemas.microsoft.com/office/word/2006/wordml" xmlns:wps="http://schemas.microsoft.com/office/word/2010/wordprocessingShape" mc:Ignorable="w14 w15 w16se w16cid w16 w16cex w16sdtdh w16sdtfl w16du wp14">
   <w:endnote w:type="separator" w:id="-1">
     <w:p>
       <w:pPr>
@@ -30931,7 +30548,7 @@
 </file>
 
 <file path=word/footer1.xml><?xml version="1.0" encoding="utf-8"?>
-<w:ftr xmlns:wpc="http://schemas.microsoft.com/office/word/2010/wordprocessingCanvas" xmlns:cx="http://schemas.microsoft.com/office/drawing/2014/chartex" xmlns:cx1="http://schemas.microsoft.com/office/drawing/2015/9/8/chartex" xmlns:cx2="http://schemas.microsoft.com/office/drawing/2015/10/21/chartex" xmlns:cx3="http://schemas.microsoft.com/office/drawing/2016/5/9/chartex" xmlns:cx4="http://schemas.microsoft.com/office/drawing/2016/5/10/chartex" xmlns:cx5="http://schemas.microsoft.com/office/drawing/2016/5/11/chartex" xmlns:cx6="http://schemas.microsoft.com/office/drawing/2016/5/12/chartex" xmlns:cx7="http://schemas.microsoft.com/office/drawing/2016/5/13/chartex" xmlns:cx8="http://schemas.microsoft.com/office/drawing/2016/5/14/chartex" xmlns:mc="http://schemas.openxmlformats.org/markup-compatibility/2006" xmlns:aink="http://schemas.microsoft.com/office/drawing/2016/ink" xmlns:am3d="http://schemas.microsoft.com/office/drawing/2017/model3d" xmlns:o="urn:schemas-microsoft-com:office:office" xmlns:oel="http://schemas.microsoft.com/office/2019/extlst" xmlns:r="http://schemas.openxmlformats.org/officeDocument/2006/relationships" xmlns:m="http://schemas.openxmlformats.org/officeDocument/2006/math" xmlns:v="urn:schemas-microsoft-com:vml" xmlns:wp14="http://schemas.microsoft.com/office/word/2010/wordprocessingDrawing" xmlns:wp="http://schemas.openxmlformats.org/drawingml/2006/wordprocessingDrawing" xmlns:w10="urn:schemas-microsoft-com:office:word" xmlns:w="http://schemas.openxmlformats.org/wordprocessingml/2006/main" xmlns:w14="http://schemas.microsoft.com/office/word/2010/wordml" xmlns:w15="http://schemas.microsoft.com/office/word/2012/wordml" xmlns:w16cex="http://schemas.microsoft.com/office/word/2018/wordml/cex" xmlns:w16cid="http://schemas.microsoft.com/office/word/2016/wordml/cid" xmlns:w16="http://schemas.microsoft.com/office/word/2018/wordml" xmlns:w16sdtdh="http://schemas.microsoft.com/office/word/2020/wordml/sdtdatahash" xmlns:w16se="http://schemas.microsoft.com/office/word/2015/wordml/symex" xmlns:wpg="http://schemas.microsoft.com/office/word/2010/wordprocessingGroup" xmlns:wpi="http://schemas.microsoft.com/office/word/2010/wordprocessingInk" xmlns:wne="http://schemas.microsoft.com/office/word/2006/wordml" xmlns:wps="http://schemas.microsoft.com/office/word/2010/wordprocessingShape" mc:Ignorable="w14 w15 w16se w16cid w16 w16cex w16sdtdh wp14">
+<w:ftr xmlns:wpc="http://schemas.microsoft.com/office/word/2010/wordprocessingCanvas" xmlns:cx="http://schemas.microsoft.com/office/drawing/2014/chartex" xmlns:cx1="http://schemas.microsoft.com/office/drawing/2015/9/8/chartex" xmlns:cx2="http://schemas.microsoft.com/office/drawing/2015/10/21/chartex" xmlns:cx3="http://schemas.microsoft.com/office/drawing/2016/5/9/chartex" xmlns:cx4="http://schemas.microsoft.com/office/drawing/2016/5/10/chartex" xmlns:cx5="http://schemas.microsoft.com/office/drawing/2016/5/11/chartex" xmlns:cx6="http://schemas.microsoft.com/office/drawing/2016/5/12/chartex" xmlns:cx7="http://schemas.microsoft.com/office/drawing/2016/5/13/chartex" xmlns:cx8="http://schemas.microsoft.com/office/drawing/2016/5/14/chartex" xmlns:mc="http://schemas.openxmlformats.org/markup-compatibility/2006" xmlns:aink="http://schemas.microsoft.com/office/drawing/2016/ink" xmlns:am3d="http://schemas.microsoft.com/office/drawing/2017/model3d" xmlns:o="urn:schemas-microsoft-com:office:office" xmlns:oel="http://schemas.microsoft.com/office/2019/extlst" xmlns:r="http://schemas.openxmlformats.org/officeDocument/2006/relationships" xmlns:m="http://schemas.openxmlformats.org/officeDocument/2006/math" xmlns:v="urn:schemas-microsoft-com:vml" xmlns:wp14="http://schemas.microsoft.com/office/word/2010/wordprocessingDrawing" xmlns:wp="http://schemas.openxmlformats.org/drawingml/2006/wordprocessingDrawing" xmlns:w10="urn:schemas-microsoft-com:office:word" xmlns:w="http://schemas.openxmlformats.org/wordprocessingml/2006/main" xmlns:w14="http://schemas.microsoft.com/office/word/2010/wordml" xmlns:w15="http://schemas.microsoft.com/office/word/2012/wordml" xmlns:w16cex="http://schemas.microsoft.com/office/word/2018/wordml/cex" xmlns:w16cid="http://schemas.microsoft.com/office/word/2016/wordml/cid" xmlns:w16="http://schemas.microsoft.com/office/word/2018/wordml" xmlns:w16du="http://schemas.microsoft.com/office/word/2023/wordml/word16du" xmlns:w16sdtdh="http://schemas.microsoft.com/office/word/2020/wordml/sdtdatahash" xmlns:w16sdtfl="http://schemas.microsoft.com/office/word/2024/wordml/sdtformatlock" xmlns:w16se="http://schemas.microsoft.com/office/word/2015/wordml/symex" xmlns:wpg="http://schemas.microsoft.com/office/word/2010/wordprocessingGroup" xmlns:wpi="http://schemas.microsoft.com/office/word/2010/wordprocessingInk" xmlns:wne="http://schemas.microsoft.com/office/word/2006/wordml" xmlns:wps="http://schemas.microsoft.com/office/word/2010/wordprocessingShape" mc:Ignorable="w14 w15 w16se w16cid w16 w16cex w16sdtdh w16sdtfl w16du wp14">
   <w:p>
     <w:pPr>
       <w:pStyle w:val="Footer"/>
@@ -31064,7 +30681,7 @@
 </file>
 
 <file path=word/footer2.xml><?xml version="1.0" encoding="utf-8"?>
-<w:ftr xmlns:wpc="http://schemas.microsoft.com/office/word/2010/wordprocessingCanvas" xmlns:cx="http://schemas.microsoft.com/office/drawing/2014/chartex" xmlns:cx1="http://schemas.microsoft.com/office/drawing/2015/9/8/chartex" xmlns:cx2="http://schemas.microsoft.com/office/drawing/2015/10/21/chartex" xmlns:cx3="http://schemas.microsoft.com/office/drawing/2016/5/9/chartex" xmlns:cx4="http://schemas.microsoft.com/office/drawing/2016/5/10/chartex" xmlns:cx5="http://schemas.microsoft.com/office/drawing/2016/5/11/chartex" xmlns:cx6="http://schemas.microsoft.com/office/drawing/2016/5/12/chartex" xmlns:cx7="http://schemas.microsoft.com/office/drawing/2016/5/13/chartex" xmlns:cx8="http://schemas.microsoft.com/office/drawing/2016/5/14/chartex" xmlns:mc="http://schemas.openxmlformats.org/markup-compatibility/2006" xmlns:aink="http://schemas.microsoft.com/office/drawing/2016/ink" xmlns:am3d="http://schemas.microsoft.com/office/drawing/2017/model3d" xmlns:o="urn:schemas-microsoft-com:office:office" xmlns:oel="http://schemas.microsoft.com/office/2019/extlst" xmlns:r="http://schemas.openxmlformats.org/officeDocument/2006/relationships" xmlns:m="http://schemas.openxmlformats.org/officeDocument/2006/math" xmlns:v="urn:schemas-microsoft-com:vml" xmlns:wp14="http://schemas.microsoft.com/office/word/2010/wordprocessingDrawing" xmlns:wp="http://schemas.openxmlformats.org/drawingml/2006/wordprocessingDrawing" xmlns:w10="urn:schemas-microsoft-com:office:word" xmlns:w="http://schemas.openxmlformats.org/wordprocessingml/2006/main" xmlns:w14="http://schemas.microsoft.com/office/word/2010/wordml" xmlns:w15="http://schemas.microsoft.com/office/word/2012/wordml" xmlns:w16cex="http://schemas.microsoft.com/office/word/2018/wordml/cex" xmlns:w16cid="http://schemas.microsoft.com/office/word/2016/wordml/cid" xmlns:w16="http://schemas.microsoft.com/office/word/2018/wordml" xmlns:w16sdtdh="http://schemas.microsoft.com/office/word/2020/wordml/sdtdatahash" xmlns:w16se="http://schemas.microsoft.com/office/word/2015/wordml/symex" xmlns:wpg="http://schemas.microsoft.com/office/word/2010/wordprocessingGroup" xmlns:wpi="http://schemas.microsoft.com/office/word/2010/wordprocessingInk" xmlns:wne="http://schemas.microsoft.com/office/word/2006/wordml" xmlns:wps="http://schemas.microsoft.com/office/word/2010/wordprocessingShape" mc:Ignorable="w14 w15 w16se w16cid w16 w16cex w16sdtdh wp14">
+<w:ftr xmlns:wpc="http://schemas.microsoft.com/office/word/2010/wordprocessingCanvas" xmlns:cx="http://schemas.microsoft.com/office/drawing/2014/chartex" xmlns:cx1="http://schemas.microsoft.com/office/drawing/2015/9/8/chartex" xmlns:cx2="http://schemas.microsoft.com/office/drawing/2015/10/21/chartex" xmlns:cx3="http://schemas.microsoft.com/office/drawing/2016/5/9/chartex" xmlns:cx4="http://schemas.microsoft.com/office/drawing/2016/5/10/chartex" xmlns:cx5="http://schemas.microsoft.com/office/drawing/2016/5/11/chartex" xmlns:cx6="http://schemas.microsoft.com/office/drawing/2016/5/12/chartex" xmlns:cx7="http://schemas.microsoft.com/office/drawing/2016/5/13/chartex" xmlns:cx8="http://schemas.microsoft.com/office/drawing/2016/5/14/chartex" xmlns:mc="http://schemas.openxmlformats.org/markup-compatibility/2006" xmlns:aink="http://schemas.microsoft.com/office/drawing/2016/ink" xmlns:am3d="http://schemas.microsoft.com/office/drawing/2017/model3d" xmlns:o="urn:schemas-microsoft-com:office:office" xmlns:oel="http://schemas.microsoft.com/office/2019/extlst" xmlns:r="http://schemas.openxmlformats.org/officeDocument/2006/relationships" xmlns:m="http://schemas.openxmlformats.org/officeDocument/2006/math" xmlns:v="urn:schemas-microsoft-com:vml" xmlns:wp14="http://schemas.microsoft.com/office/word/2010/wordprocessingDrawing" xmlns:wp="http://schemas.openxmlformats.org/drawingml/2006/wordprocessingDrawing" xmlns:w10="urn:schemas-microsoft-com:office:word" xmlns:w="http://schemas.openxmlformats.org/wordprocessingml/2006/main" xmlns:w14="http://schemas.microsoft.com/office/word/2010/wordml" xmlns:w15="http://schemas.microsoft.com/office/word/2012/wordml" xmlns:w16cex="http://schemas.microsoft.com/office/word/2018/wordml/cex" xmlns:w16cid="http://schemas.microsoft.com/office/word/2016/wordml/cid" xmlns:w16="http://schemas.microsoft.com/office/word/2018/wordml" xmlns:w16du="http://schemas.microsoft.com/office/word/2023/wordml/word16du" xmlns:w16sdtdh="http://schemas.microsoft.com/office/word/2020/wordml/sdtdatahash" xmlns:w16sdtfl="http://schemas.microsoft.com/office/word/2024/wordml/sdtformatlock" xmlns:w16se="http://schemas.microsoft.com/office/word/2015/wordml/symex" xmlns:wpg="http://schemas.microsoft.com/office/word/2010/wordprocessingGroup" xmlns:wpi="http://schemas.microsoft.com/office/word/2010/wordprocessingInk" xmlns:wne="http://schemas.microsoft.com/office/word/2006/wordml" xmlns:wps="http://schemas.microsoft.com/office/word/2010/wordprocessingShape" mc:Ignorable="w14 w15 w16se w16cid w16 w16cex w16sdtdh w16sdtfl w16du wp14">
   <w:p>
     <w:pPr>
       <w:pBdr>
@@ -31260,7 +30877,7 @@
 </file>
 
 <file path=word/footnotes.xml><?xml version="1.0" encoding="utf-8"?>
-<w:footnotes xmlns:wpc="http://schemas.microsoft.com/office/word/2010/wordprocessingCanvas" xmlns:cx="http://schemas.microsoft.com/office/drawing/2014/chartex" xmlns:cx1="http://schemas.microsoft.com/office/drawing/2015/9/8/chartex" xmlns:cx2="http://schemas.microsoft.com/office/drawing/2015/10/21/chartex" xmlns:cx3="http://schemas.microsoft.com/office/drawing/2016/5/9/chartex" xmlns:cx4="http://schemas.microsoft.com/office/drawing/2016/5/10/chartex" xmlns:cx5="http://schemas.microsoft.com/office/drawing/2016/5/11/chartex" xmlns:cx6="http://schemas.microsoft.com/office/drawing/2016/5/12/chartex" xmlns:cx7="http://schemas.microsoft.com/office/drawing/2016/5/13/chartex" xmlns:cx8="http://schemas.microsoft.com/office/drawing/2016/5/14/chartex" xmlns:mc="http://schemas.openxmlformats.org/markup-compatibility/2006" xmlns:aink="http://schemas.microsoft.com/office/drawing/2016/ink" xmlns:am3d="http://schemas.microsoft.com/office/drawing/2017/model3d" xmlns:o="urn:schemas-microsoft-com:office:office" xmlns:oel="http://schemas.microsoft.com/office/2019/extlst" xmlns:r="http://schemas.openxmlformats.org/officeDocument/2006/relationships" xmlns:m="http://schemas.openxmlformats.org/officeDocument/2006/math" xmlns:v="urn:schemas-microsoft-com:vml" xmlns:wp14="http://schemas.microsoft.com/office/word/2010/wordprocessingDrawing" xmlns:wp="http://schemas.openxmlformats.org/drawingml/2006/wordprocessingDrawing" xmlns:w10="urn:schemas-microsoft-com:office:word" xmlns:w="http://schemas.openxmlformats.org/wordprocessingml/2006/main" xmlns:w14="http://schemas.microsoft.com/office/word/2010/wordml" xmlns:w15="http://schemas.microsoft.com/office/word/2012/wordml" xmlns:w16cex="http://schemas.microsoft.com/office/word/2018/wordml/cex" xmlns:w16cid="http://schemas.microsoft.com/office/word/2016/wordml/cid" xmlns:w16="http://schemas.microsoft.com/office/word/2018/wordml" xmlns:w16sdtdh="http://schemas.microsoft.com/office/word/2020/wordml/sdtdatahash" xmlns:w16se="http://schemas.microsoft.com/office/word/2015/wordml/symex" xmlns:wpg="http://schemas.microsoft.com/office/word/2010/wordprocessingGroup" xmlns:wpi="http://schemas.microsoft.com/office/word/2010/wordprocessingInk" xmlns:wne="http://schemas.microsoft.com/office/word/2006/wordml" xmlns:wps="http://schemas.microsoft.com/office/word/2010/wordprocessingShape" mc:Ignorable="w14 w15 w16se w16cid w16 w16cex w16sdtdh wp14">
+<w:footnotes xmlns:wpc="http://schemas.microsoft.com/office/word/2010/wordprocessingCanvas" xmlns:cx="http://schemas.microsoft.com/office/drawing/2014/chartex" xmlns:cx1="http://schemas.microsoft.com/office/drawing/2015/9/8/chartex" xmlns:cx2="http://schemas.microsoft.com/office/drawing/2015/10/21/chartex" xmlns:cx3="http://schemas.microsoft.com/office/drawing/2016/5/9/chartex" xmlns:cx4="http://schemas.microsoft.com/office/drawing/2016/5/10/chartex" xmlns:cx5="http://schemas.microsoft.com/office/drawing/2016/5/11/chartex" xmlns:cx6="http://schemas.microsoft.com/office/drawing/2016/5/12/chartex" xmlns:cx7="http://schemas.microsoft.com/office/drawing/2016/5/13/chartex" xmlns:cx8="http://schemas.microsoft.com/office/drawing/2016/5/14/chartex" xmlns:mc="http://schemas.openxmlformats.org/markup-compatibility/2006" xmlns:aink="http://schemas.microsoft.com/office/drawing/2016/ink" xmlns:am3d="http://schemas.microsoft.com/office/drawing/2017/model3d" xmlns:o="urn:schemas-microsoft-com:office:office" xmlns:oel="http://schemas.microsoft.com/office/2019/extlst" xmlns:r="http://schemas.openxmlformats.org/officeDocument/2006/relationships" xmlns:m="http://schemas.openxmlformats.org/officeDocument/2006/math" xmlns:v="urn:schemas-microsoft-com:vml" xmlns:wp14="http://schemas.microsoft.com/office/word/2010/wordprocessingDrawing" xmlns:wp="http://schemas.openxmlformats.org/drawingml/2006/wordprocessingDrawing" xmlns:w10="urn:schemas-microsoft-com:office:word" xmlns:w="http://schemas.openxmlformats.org/wordprocessingml/2006/main" xmlns:w14="http://schemas.microsoft.com/office/word/2010/wordml" xmlns:w15="http://schemas.microsoft.com/office/word/2012/wordml" xmlns:w16cex="http://schemas.microsoft.com/office/word/2018/wordml/cex" xmlns:w16cid="http://schemas.microsoft.com/office/word/2016/wordml/cid" xmlns:w16="http://schemas.microsoft.com/office/word/2018/wordml" xmlns:w16du="http://schemas.microsoft.com/office/word/2023/wordml/word16du" xmlns:w16sdtdh="http://schemas.microsoft.com/office/word/2020/wordml/sdtdatahash" xmlns:w16sdtfl="http://schemas.microsoft.com/office/word/2024/wordml/sdtformatlock" xmlns:w16se="http://schemas.microsoft.com/office/word/2015/wordml/symex" xmlns:wpg="http://schemas.microsoft.com/office/word/2010/wordprocessingGroup" xmlns:wpi="http://schemas.microsoft.com/office/word/2010/wordprocessingInk" xmlns:wne="http://schemas.microsoft.com/office/word/2006/wordml" xmlns:wps="http://schemas.microsoft.com/office/word/2010/wordprocessingShape" mc:Ignorable="w14 w15 w16se w16cid w16 w16cex w16sdtdh w16sdtfl w16du wp14">
   <w:footnote w:type="separator" w:id="-1">
     <w:p>
       <w:pPr>
@@ -31285,7 +30902,7 @@
 </file>
 
 <file path=word/header1.xml><?xml version="1.0" encoding="utf-8"?>
-<w:hdr xmlns:wpc="http://schemas.microsoft.com/office/word/2010/wordprocessingCanvas" xmlns:cx="http://schemas.microsoft.com/office/drawing/2014/chartex" xmlns:cx1="http://schemas.microsoft.com/office/drawing/2015/9/8/chartex" xmlns:cx2="http://schemas.microsoft.com/office/drawing/2015/10/21/chartex" xmlns:cx3="http://schemas.microsoft.com/office/drawing/2016/5/9/chartex" xmlns:cx4="http://schemas.microsoft.com/office/drawing/2016/5/10/chartex" xmlns:cx5="http://schemas.microsoft.com/office/drawing/2016/5/11/chartex" xmlns:cx6="http://schemas.microsoft.com/office/drawing/2016/5/12/chartex" xmlns:cx7="http://schemas.microsoft.com/office/drawing/2016/5/13/chartex" xmlns:cx8="http://schemas.microsoft.com/office/drawing/2016/5/14/chartex" xmlns:mc="http://schemas.openxmlformats.org/markup-compatibility/2006" xmlns:aink="http://schemas.microsoft.com/office/drawing/2016/ink" xmlns:am3d="http://schemas.microsoft.com/office/drawing/2017/model3d" xmlns:o="urn:schemas-microsoft-com:office:office" xmlns:oel="http://schemas.microsoft.com/office/2019/extlst" xmlns:r="http://schemas.openxmlformats.org/officeDocument/2006/relationships" xmlns:m="http://schemas.openxmlformats.org/officeDocument/2006/math" xmlns:v="urn:schemas-microsoft-com:vml" xmlns:wp14="http://schemas.microsoft.com/office/word/2010/wordprocessingDrawing" xmlns:wp="http://schemas.openxmlformats.org/drawingml/2006/wordprocessingDrawing" xmlns:w10="urn:schemas-microsoft-com:office:word" xmlns:w="http://schemas.openxmlformats.org/wordprocessingml/2006/main" xmlns:w14="http://schemas.microsoft.com/office/word/2010/wordml" xmlns:w15="http://schemas.microsoft.com/office/word/2012/wordml" xmlns:w16cex="http://schemas.microsoft.com/office/word/2018/wordml/cex" xmlns:w16cid="http://schemas.microsoft.com/office/word/2016/wordml/cid" xmlns:w16="http://schemas.microsoft.com/office/word/2018/wordml" xmlns:w16sdtdh="http://schemas.microsoft.com/office/word/2020/wordml/sdtdatahash" xmlns:w16se="http://schemas.microsoft.com/office/word/2015/wordml/symex" xmlns:wpg="http://schemas.microsoft.com/office/word/2010/wordprocessingGroup" xmlns:wpi="http://schemas.microsoft.com/office/word/2010/wordprocessingInk" xmlns:wne="http://schemas.microsoft.com/office/word/2006/wordml" xmlns:wps="http://schemas.microsoft.com/office/word/2010/wordprocessingShape" mc:Ignorable="w14 w15 w16se w16cid w16 w16cex w16sdtdh wp14">
+<w:hdr xmlns:wpc="http://schemas.microsoft.com/office/word/2010/wordprocessingCanvas" xmlns:cx="http://schemas.microsoft.com/office/drawing/2014/chartex" xmlns:cx1="http://schemas.microsoft.com/office/drawing/2015/9/8/chartex" xmlns:cx2="http://schemas.microsoft.com/office/drawing/2015/10/21/chartex" xmlns:cx3="http://schemas.microsoft.com/office/drawing/2016/5/9/chartex" xmlns:cx4="http://schemas.microsoft.com/office/drawing/2016/5/10/chartex" xmlns:cx5="http://schemas.microsoft.com/office/drawing/2016/5/11/chartex" xmlns:cx6="http://schemas.microsoft.com/office/drawing/2016/5/12/chartex" xmlns:cx7="http://schemas.microsoft.com/office/drawing/2016/5/13/chartex" xmlns:cx8="http://schemas.microsoft.com/office/drawing/2016/5/14/chartex" xmlns:mc="http://schemas.openxmlformats.org/markup-compatibility/2006" xmlns:aink="http://schemas.microsoft.com/office/drawing/2016/ink" xmlns:am3d="http://schemas.microsoft.com/office/drawing/2017/model3d" xmlns:o="urn:schemas-microsoft-com:office:office" xmlns:oel="http://schemas.microsoft.com/office/2019/extlst" xmlns:r="http://schemas.openxmlformats.org/officeDocument/2006/relationships" xmlns:m="http://schemas.openxmlformats.org/officeDocument/2006/math" xmlns:v="urn:schemas-microsoft-com:vml" xmlns:wp14="http://schemas.microsoft.com/office/word/2010/wordprocessingDrawing" xmlns:wp="http://schemas.openxmlformats.org/drawingml/2006/wordprocessingDrawing" xmlns:w10="urn:schemas-microsoft-com:office:word" xmlns:w="http://schemas.openxmlformats.org/wordprocessingml/2006/main" xmlns:w14="http://schemas.microsoft.com/office/word/2010/wordml" xmlns:w15="http://schemas.microsoft.com/office/word/2012/wordml" xmlns:w16cex="http://schemas.microsoft.com/office/word/2018/wordml/cex" xmlns:w16cid="http://schemas.microsoft.com/office/word/2016/wordml/cid" xmlns:w16="http://schemas.microsoft.com/office/word/2018/wordml" xmlns:w16du="http://schemas.microsoft.com/office/word/2023/wordml/word16du" xmlns:w16sdtdh="http://schemas.microsoft.com/office/word/2020/wordml/sdtdatahash" xmlns:w16sdtfl="http://schemas.microsoft.com/office/word/2024/wordml/sdtformatlock" xmlns:w16se="http://schemas.microsoft.com/office/word/2015/wordml/symex" xmlns:wpg="http://schemas.microsoft.com/office/word/2010/wordprocessingGroup" xmlns:wpi="http://schemas.microsoft.com/office/word/2010/wordprocessingInk" xmlns:wne="http://schemas.microsoft.com/office/word/2006/wordml" xmlns:wps="http://schemas.microsoft.com/office/word/2010/wordprocessingShape" mc:Ignorable="w14 w15 w16se w16cid w16 w16cex w16sdtdh w16sdtfl w16du wp14">
   <w:p>
     <w:pPr>
       <w:pStyle w:val="Header"/>
@@ -31298,7 +30915,7 @@
 </file>
 
 <file path=word/header2.xml><?xml version="1.0" encoding="utf-8"?>
-<w:hdr xmlns:wpc="http://schemas.microsoft.com/office/word/2010/wordprocessingCanvas" xmlns:cx="http://schemas.microsoft.com/office/drawing/2014/chartex" xmlns:cx1="http://schemas.microsoft.com/office/drawing/2015/9/8/chartex" xmlns:cx2="http://schemas.microsoft.com/office/drawing/2015/10/21/chartex" xmlns:cx3="http://schemas.microsoft.com/office/drawing/2016/5/9/chartex" xmlns:cx4="http://schemas.microsoft.com/office/drawing/2016/5/10/chartex" xmlns:cx5="http://schemas.microsoft.com/office/drawing/2016/5/11/chartex" xmlns:cx6="http://schemas.microsoft.com/office/drawing/2016/5/12/chartex" xmlns:cx7="http://schemas.microsoft.com/office/drawing/2016/5/13/chartex" xmlns:cx8="http://schemas.microsoft.com/office/drawing/2016/5/14/chartex" xmlns:mc="http://schemas.openxmlformats.org/markup-compatibility/2006" xmlns:aink="http://schemas.microsoft.com/office/drawing/2016/ink" xmlns:am3d="http://schemas.microsoft.com/office/drawing/2017/model3d" xmlns:o="urn:schemas-microsoft-com:office:office" xmlns:oel="http://schemas.microsoft.com/office/2019/extlst" xmlns:r="http://schemas.openxmlformats.org/officeDocument/2006/relationships" xmlns:m="http://schemas.openxmlformats.org/officeDocument/2006/math" xmlns:v="urn:schemas-microsoft-com:vml" xmlns:wp14="http://schemas.microsoft.com/office/word/2010/wordprocessingDrawing" xmlns:wp="http://schemas.openxmlformats.org/drawingml/2006/wordprocessingDrawing" xmlns:w10="urn:schemas-microsoft-com:office:word" xmlns:w="http://schemas.openxmlformats.org/wordprocessingml/2006/main" xmlns:w14="http://schemas.microsoft.com/office/word/2010/wordml" xmlns:w15="http://schemas.microsoft.com/office/word/2012/wordml" xmlns:w16cex="http://schemas.microsoft.com/office/word/2018/wordml/cex" xmlns:w16cid="http://schemas.microsoft.com/office/word/2016/wordml/cid" xmlns:w16="http://schemas.microsoft.com/office/word/2018/wordml" xmlns:w16sdtdh="http://schemas.microsoft.com/office/word/2020/wordml/sdtdatahash" xmlns:w16se="http://schemas.microsoft.com/office/word/2015/wordml/symex" xmlns:wpg="http://schemas.microsoft.com/office/word/2010/wordprocessingGroup" xmlns:wpi="http://schemas.microsoft.com/office/word/2010/wordprocessingInk" xmlns:wne="http://schemas.microsoft.com/office/word/2006/wordml" xmlns:wps="http://schemas.microsoft.com/office/word/2010/wordprocessingShape" mc:Ignorable="w14 w15 w16se w16cid w16 w16cex w16sdtdh wp14">
+<w:hdr xmlns:wpc="http://schemas.microsoft.com/office/word/2010/wordprocessingCanvas" xmlns:cx="http://schemas.microsoft.com/office/drawing/2014/chartex" xmlns:cx1="http://schemas.microsoft.com/office/drawing/2015/9/8/chartex" xmlns:cx2="http://schemas.microsoft.com/office/drawing/2015/10/21/chartex" xmlns:cx3="http://schemas.microsoft.com/office/drawing/2016/5/9/chartex" xmlns:cx4="http://schemas.microsoft.com/office/drawing/2016/5/10/chartex" xmlns:cx5="http://schemas.microsoft.com/office/drawing/2016/5/11/chartex" xmlns:cx6="http://schemas.microsoft.com/office/drawing/2016/5/12/chartex" xmlns:cx7="http://schemas.microsoft.com/office/drawing/2016/5/13/chartex" xmlns:cx8="http://schemas.microsoft.com/office/drawing/2016/5/14/chartex" xmlns:mc="http://schemas.openxmlformats.org/markup-compatibility/2006" xmlns:aink="http://schemas.microsoft.com/office/drawing/2016/ink" xmlns:am3d="http://schemas.microsoft.com/office/drawing/2017/model3d" xmlns:o="urn:schemas-microsoft-com:office:office" xmlns:oel="http://schemas.microsoft.com/office/2019/extlst" xmlns:r="http://schemas.openxmlformats.org/officeDocument/2006/relationships" xmlns:m="http://schemas.openxmlformats.org/officeDocument/2006/math" xmlns:v="urn:schemas-microsoft-com:vml" xmlns:wp14="http://schemas.microsoft.com/office/word/2010/wordprocessingDrawing" xmlns:wp="http://schemas.openxmlformats.org/drawingml/2006/wordprocessingDrawing" xmlns:w10="urn:schemas-microsoft-com:office:word" xmlns:w="http://schemas.openxmlformats.org/wordprocessingml/2006/main" xmlns:w14="http://schemas.microsoft.com/office/word/2010/wordml" xmlns:w15="http://schemas.microsoft.com/office/word/2012/wordml" xmlns:w16cex="http://schemas.microsoft.com/office/word/2018/wordml/cex" xmlns:w16cid="http://schemas.microsoft.com/office/word/2016/wordml/cid" xmlns:w16="http://schemas.microsoft.com/office/word/2018/wordml" xmlns:w16du="http://schemas.microsoft.com/office/word/2023/wordml/word16du" xmlns:w16sdtdh="http://schemas.microsoft.com/office/word/2020/wordml/sdtdatahash" xmlns:w16sdtfl="http://schemas.microsoft.com/office/word/2024/wordml/sdtformatlock" xmlns:w16se="http://schemas.microsoft.com/office/word/2015/wordml/symex" xmlns:wpg="http://schemas.microsoft.com/office/word/2010/wordprocessingGroup" xmlns:wpi="http://schemas.microsoft.com/office/word/2010/wordprocessingInk" xmlns:wne="http://schemas.microsoft.com/office/word/2006/wordml" xmlns:wps="http://schemas.microsoft.com/office/word/2010/wordprocessingShape" mc:Ignorable="w14 w15 w16se w16cid w16 w16cex w16sdtdh w16sdtfl w16du wp14">
   <w:p>
     <w:pPr>
       <w:pStyle w:val="Header"/>
@@ -31311,7 +30928,7 @@
 </file>
 
 <file path=word/styles.xml><?xml version="1.0" encoding="utf-8"?>
-<w:styles xmlns:mc="http://schemas.openxmlformats.org/markup-compatibility/2006" xmlns:r="http://schemas.openxmlformats.org/officeDocument/2006/relationships" xmlns:w="http://schemas.openxmlformats.org/wordprocessingml/2006/main" xmlns:w14="http://schemas.microsoft.com/office/word/2010/wordml" xmlns:w15="http://schemas.microsoft.com/office/word/2012/wordml" xmlns:w16cex="http://schemas.microsoft.com/office/word/2018/wordml/cex" xmlns:w16cid="http://schemas.microsoft.com/office/word/2016/wordml/cid" xmlns:w16="http://schemas.microsoft.com/office/word/2018/wordml" xmlns:w16sdtdh="http://schemas.microsoft.com/office/word/2020/wordml/sdtdatahash" xmlns:w16se="http://schemas.microsoft.com/office/word/2015/wordml/symex" mc:Ignorable="w14 w15 w16se w16cid w16 w16cex w16sdtdh">
+<w:styles xmlns:mc="http://schemas.openxmlformats.org/markup-compatibility/2006" xmlns:r="http://schemas.openxmlformats.org/officeDocument/2006/relationships" xmlns:w="http://schemas.openxmlformats.org/wordprocessingml/2006/main" xmlns:w14="http://schemas.microsoft.com/office/word/2010/wordml" xmlns:w15="http://schemas.microsoft.com/office/word/2012/wordml" xmlns:w16cex="http://schemas.microsoft.com/office/word/2018/wordml/cex" xmlns:w16cid="http://schemas.microsoft.com/office/word/2016/wordml/cid" xmlns:w16="http://schemas.microsoft.com/office/word/2018/wordml" xmlns:w16du="http://schemas.microsoft.com/office/word/2023/wordml/word16du" xmlns:w16sdtdh="http://schemas.microsoft.com/office/word/2020/wordml/sdtdatahash" xmlns:w16sdtfl="http://schemas.microsoft.com/office/word/2024/wordml/sdtformatlock" xmlns:w16se="http://schemas.microsoft.com/office/word/2015/wordml/symex" mc:Ignorable="w14 w15 w16se w16cid w16 w16cex w16sdtdh w16sdtfl w16du">
   <w:docDefaults>
     <w:rPrDefault>
       <w:rPr>
@@ -31427,6 +31044,7 @@
     <w:lsdException w:name="HTML Sample" w:semiHidden="1" w:unhideWhenUsed="1"/>
     <w:lsdException w:name="HTML Typewriter" w:semiHidden="1" w:unhideWhenUsed="1"/>
     <w:lsdException w:name="HTML Variable" w:semiHidden="1" w:unhideWhenUsed="1"/>
+    <w:lsdException w:name="Normal Table" w:semiHidden="1" w:unhideWhenUsed="1"/>
     <w:lsdException w:name="annotation subject" w:semiHidden="1" w:unhideWhenUsed="1"/>
     <w:lsdException w:name="No List" w:semiHidden="1" w:unhideWhenUsed="1"/>
     <w:lsdException w:name="Outline List 1" w:semiHidden="1" w:unhideWhenUsed="1"/>
@@ -31469,8 +31087,11 @@
     <w:lsdException w:name="Table Contemporary" w:semiHidden="1" w:unhideWhenUsed="1"/>
     <w:lsdException w:name="Table Elegant" w:semiHidden="1" w:unhideWhenUsed="1"/>
     <w:lsdException w:name="Table Professional" w:semiHidden="1" w:unhideWhenUsed="1"/>
+    <w:lsdException w:name="Table Subtle 1" w:semiHidden="1" w:unhideWhenUsed="1"/>
     <w:lsdException w:name="Table Subtle 2" w:semiHidden="1" w:unhideWhenUsed="1"/>
     <w:lsdException w:name="Table Web 1" w:semiHidden="1" w:unhideWhenUsed="1"/>
+    <w:lsdException w:name="Table Web 2" w:semiHidden="1" w:unhideWhenUsed="1"/>
+    <w:lsdException w:name="Table Web 3" w:semiHidden="1" w:unhideWhenUsed="1"/>
     <w:lsdException w:name="Balloon Text" w:semiHidden="1" w:unhideWhenUsed="1"/>
     <w:lsdException w:name="Table Grid" w:uiPriority="59"/>
     <w:lsdException w:name="Table Theme" w:semiHidden="1" w:unhideWhenUsed="1"/>

</xml_diff>